<commit_message>
Added Mike as Author!
</commit_message>
<xml_diff>
--- a/14-Microsoft SQL using Java.docx
+++ b/14-Microsoft SQL using Java.docx
@@ -1,6 +1,6 @@
 
 <file path=word/document.xml><?xml version="1.0" encoding="utf-8"?>
-<w:document xmlns:wpc="http://schemas.microsoft.com/office/word/2010/wordprocessingCanvas" xmlns:cx="http://schemas.microsoft.com/office/drawing/2014/chartex" xmlns:cx1="http://schemas.microsoft.com/office/drawing/2015/9/8/chartex" xmlns:cx2="http://schemas.microsoft.com/office/drawing/2015/10/21/chartex" xmlns:cx3="http://schemas.microsoft.com/office/drawing/2016/5/9/chartex" xmlns:cx4="http://schemas.microsoft.com/office/drawing/2016/5/10/chartex" xmlns:cx5="http://schemas.microsoft.com/office/drawing/2016/5/11/chartex" xmlns:cx6="http://schemas.microsoft.com/office/drawing/2016/5/12/chartex" xmlns:cx7="http://schemas.microsoft.com/office/drawing/2016/5/13/chartex" xmlns:cx8="http://schemas.microsoft.com/office/drawing/2016/5/14/chartex" xmlns:mc="http://schemas.openxmlformats.org/markup-compatibility/2006" xmlns:aink="http://schemas.microsoft.com/office/drawing/2016/ink" xmlns:am3d="http://schemas.microsoft.com/office/drawing/2017/model3d" xmlns:o="urn:schemas-microsoft-com:office:office" xmlns:oel="http://schemas.microsoft.com/office/2019/extlst" xmlns:r="http://schemas.openxmlformats.org/officeDocument/2006/relationships" xmlns:m="http://schemas.openxmlformats.org/officeDocument/2006/math" xmlns:v="urn:schemas-microsoft-com:vml" xmlns:wp14="http://schemas.microsoft.com/office/word/2010/wordprocessingDrawing" xmlns:wp="http://schemas.openxmlformats.org/drawingml/2006/wordprocessingDrawing" xmlns:w10="urn:schemas-microsoft-com:office:word" xmlns:w="http://schemas.openxmlformats.org/wordprocessingml/2006/main" xmlns:w14="http://schemas.microsoft.com/office/word/2010/wordml" xmlns:w15="http://schemas.microsoft.com/office/word/2012/wordml" xmlns:w16cex="http://schemas.microsoft.com/office/word/2018/wordml/cex" xmlns:w16cid="http://schemas.microsoft.com/office/word/2016/wordml/cid" xmlns:w16="http://schemas.microsoft.com/office/word/2018/wordml" xmlns:w16sdtdh="http://schemas.microsoft.com/office/word/2020/wordml/sdtdatahash" xmlns:w16se="http://schemas.microsoft.com/office/word/2015/wordml/symex" xmlns:wpg="http://schemas.microsoft.com/office/word/2010/wordprocessingGroup" xmlns:wpi="http://schemas.microsoft.com/office/word/2010/wordprocessingInk" xmlns:wne="http://schemas.microsoft.com/office/word/2006/wordml" xmlns:wps="http://schemas.microsoft.com/office/word/2010/wordprocessingShape" mc:Ignorable="w14 w15 w16se w16cid w16 w16cex w16sdtdh wp14">
+<w:document xmlns:wpc="http://schemas.microsoft.com/office/word/2010/wordprocessingCanvas" xmlns:cx="http://schemas.microsoft.com/office/drawing/2014/chartex" xmlns:cx1="http://schemas.microsoft.com/office/drawing/2015/9/8/chartex" xmlns:cx2="http://schemas.microsoft.com/office/drawing/2015/10/21/chartex" xmlns:cx3="http://schemas.microsoft.com/office/drawing/2016/5/9/chartex" xmlns:cx4="http://schemas.microsoft.com/office/drawing/2016/5/10/chartex" xmlns:cx5="http://schemas.microsoft.com/office/drawing/2016/5/11/chartex" xmlns:cx6="http://schemas.microsoft.com/office/drawing/2016/5/12/chartex" xmlns:cx7="http://schemas.microsoft.com/office/drawing/2016/5/13/chartex" xmlns:cx8="http://schemas.microsoft.com/office/drawing/2016/5/14/chartex" xmlns:mc="http://schemas.openxmlformats.org/markup-compatibility/2006" xmlns:aink="http://schemas.microsoft.com/office/drawing/2016/ink" xmlns:am3d="http://schemas.microsoft.com/office/drawing/2017/model3d" xmlns:o="urn:schemas-microsoft-com:office:office" xmlns:oel="http://schemas.microsoft.com/office/2019/extlst" xmlns:r="http://schemas.openxmlformats.org/officeDocument/2006/relationships" xmlns:m="http://schemas.openxmlformats.org/officeDocument/2006/math" xmlns:v="urn:schemas-microsoft-com:vml" xmlns:wp14="http://schemas.microsoft.com/office/word/2010/wordprocessingDrawing" xmlns:wp="http://schemas.openxmlformats.org/drawingml/2006/wordprocessingDrawing" xmlns:w10="urn:schemas-microsoft-com:office:word" xmlns:w="http://schemas.openxmlformats.org/wordprocessingml/2006/main" xmlns:w14="http://schemas.microsoft.com/office/word/2010/wordml" xmlns:w15="http://schemas.microsoft.com/office/word/2012/wordml" xmlns:w16cex="http://schemas.microsoft.com/office/word/2018/wordml/cex" xmlns:w16cid="http://schemas.microsoft.com/office/word/2016/wordml/cid" xmlns:w16="http://schemas.microsoft.com/office/word/2018/wordml" xmlns:w16du="http://schemas.microsoft.com/office/word/2023/wordml/word16du" xmlns:w16sdtdh="http://schemas.microsoft.com/office/word/2020/wordml/sdtdatahash" xmlns:w16sdtfl="http://schemas.microsoft.com/office/word/2024/wordml/sdtformatlock" xmlns:w16se="http://schemas.microsoft.com/office/word/2015/wordml/symex" xmlns:wpg="http://schemas.microsoft.com/office/word/2010/wordprocessingGroup" xmlns:wpi="http://schemas.microsoft.com/office/word/2010/wordprocessingInk" xmlns:wne="http://schemas.microsoft.com/office/word/2006/wordml" xmlns:wps="http://schemas.microsoft.com/office/word/2010/wordprocessingShape" mc:Ignorable="w14 w15 w16se w16cid w16 w16cex w16sdtdh w16sdtfl w16du wp14">
   <w:body>
     <w:p>
       <w:pPr>
@@ -28,15 +28,7 @@
     </w:p>
     <w:p>
       <w:r>
-        <w:t xml:space="preserve">In the following lab you'll practice creating a new user for MS-SQL using SSMS. You will then set the right this new should have and then use the </w:t>
-      </w:r>
-      <w:proofErr w:type="gramStart"/>
-      <w:r>
-        <w:t>user name</w:t>
-      </w:r>
-      <w:proofErr w:type="gramEnd"/>
-      <w:r>
-        <w:t xml:space="preserve"> and password in code to connect and extract data from a database using Java.</w:t>
+        <w:t>In the following lab you'll practice creating a new user for MS-SQL using SSMS. You will then set the right this new should have and then use the user name and password in code to connect and extract data from a database using Java.</w:t>
       </w:r>
     </w:p>
     <w:p>
@@ -56,15 +48,7 @@
         </w:numPr>
       </w:pPr>
       <w:r>
-        <w:t xml:space="preserve">In this lab you will require a database called </w:t>
-      </w:r>
-      <w:proofErr w:type="spellStart"/>
-      <w:r>
-        <w:t>QAStore</w:t>
-      </w:r>
-      <w:proofErr w:type="spellEnd"/>
-      <w:r>
-        <w:t>.</w:t>
+        <w:t>In this lab you will require a database called QAStore.</w:t>
       </w:r>
     </w:p>
     <w:p>
@@ -78,7 +62,6 @@
       <w:r>
         <w:t xml:space="preserve">To install this database, double-click on the file </w:t>
       </w:r>
-      <w:proofErr w:type="spellStart"/>
       <w:r>
         <w:rPr>
           <w:b/>
@@ -86,7 +69,6 @@
         </w:rPr>
         <w:t>QAStore.sql</w:t>
       </w:r>
-      <w:proofErr w:type="spellEnd"/>
       <w:r>
         <w:t xml:space="preserve"> in the Resources folder.</w:t>
       </w:r>
@@ -131,15 +113,7 @@
         </w:numPr>
       </w:pPr>
       <w:r>
-        <w:t xml:space="preserve">Click on the Execute button (or press F5) to install the </w:t>
-      </w:r>
-      <w:proofErr w:type="spellStart"/>
-      <w:r>
-        <w:t>QAStore</w:t>
-      </w:r>
-      <w:proofErr w:type="spellEnd"/>
-      <w:r>
-        <w:t xml:space="preserve"> database.</w:t>
+        <w:t>Click on the Execute button (or press F5) to install the QAStore database.</w:t>
       </w:r>
     </w:p>
     <w:p>
@@ -262,7 +236,6 @@
           <w:numId w:val="2"/>
         </w:numPr>
       </w:pPr>
-      <w:proofErr w:type="gramStart"/>
       <w:r>
         <w:t xml:space="preserve">Select </w:t>
       </w:r>
@@ -283,14 +256,7 @@
         <w:rPr>
           <w:b/>
         </w:rPr>
-        <w:t>QL</w:t>
-      </w:r>
-      <w:proofErr w:type="gramEnd"/>
-      <w:r>
-        <w:rPr>
-          <w:b/>
-        </w:rPr>
-        <w:t xml:space="preserve"> Server and Windows Authentication mode</w:t>
+        <w:t>QL Server and Windows Authentication mode</w:t>
       </w:r>
     </w:p>
     <w:p>
@@ -405,7 +371,6 @@
         </w:rPr>
         <w:t> </w:t>
       </w:r>
-      <w:proofErr w:type="spellStart"/>
       <w:r>
         <w:rPr>
           <w:rFonts w:ascii="Arial" w:hAnsi="Arial" w:cs="Arial"/>
@@ -415,7 +380,6 @@
         </w:rPr>
         <w:t>compmgmt.msc</w:t>
       </w:r>
-      <w:proofErr w:type="spellEnd"/>
       <w:r>
         <w:rPr>
           <w:rFonts w:ascii="Arial" w:hAnsi="Arial" w:cs="Arial"/>
@@ -430,15 +394,7 @@
         <w:pStyle w:val="ListParagraph"/>
       </w:pPr>
       <w:r>
-        <w:t xml:space="preserve">This will run the Computer </w:t>
-      </w:r>
-      <w:proofErr w:type="gramStart"/>
-      <w:r>
-        <w:t>management  application</w:t>
-      </w:r>
-      <w:proofErr w:type="gramEnd"/>
-      <w:r>
-        <w:t>.</w:t>
+        <w:t>This will run the Computer management  application.</w:t>
       </w:r>
     </w:p>
     <w:p>
@@ -471,21 +427,7 @@
         <w:rPr>
           <w:b/>
         </w:rPr>
-        <w:t xml:space="preserve">SQL </w:t>
-      </w:r>
-      <w:proofErr w:type="spellStart"/>
-      <w:r>
-        <w:rPr>
-          <w:b/>
-        </w:rPr>
-        <w:t>Sever</w:t>
-      </w:r>
-      <w:proofErr w:type="spellEnd"/>
-      <w:r>
-        <w:rPr>
-          <w:b/>
-        </w:rPr>
-        <w:t xml:space="preserve"> Network Configuration</w:t>
+        <w:t>SQL Sever Network Configuration</w:t>
       </w:r>
       <w:r>
         <w:rPr>
@@ -597,15 +539,7 @@
         <w:t xml:space="preserve"> </w:t>
       </w:r>
       <w:r>
-        <w:t xml:space="preserve">the Protocols for SQLEXPRESS (on the </w:t>
-      </w:r>
-      <w:proofErr w:type="gramStart"/>
-      <w:r>
-        <w:t>right hand</w:t>
-      </w:r>
-      <w:proofErr w:type="gramEnd"/>
-      <w:r>
-        <w:t xml:space="preserve"> side)</w:t>
+        <w:t>the Protocols for SQLEXPRESS (on the right hand side)</w:t>
       </w:r>
     </w:p>
     <w:p>
@@ -638,15 +572,7 @@
         <w:t xml:space="preserve">menu </w:t>
       </w:r>
       <w:r>
-        <w:t xml:space="preserve">from the </w:t>
-      </w:r>
-      <w:proofErr w:type="gramStart"/>
-      <w:r>
-        <w:t>right hand</w:t>
-      </w:r>
-      <w:proofErr w:type="gramEnd"/>
-      <w:r>
-        <w:t xml:space="preserve"> side</w:t>
+        <w:t>from the right hand side</w:t>
       </w:r>
     </w:p>
     <w:p>
@@ -661,11 +587,7 @@
         <w:t xml:space="preserve">Double click on the </w:t>
       </w:r>
       <w:r>
-        <w:t xml:space="preserve">Enabled attribute to change its state to </w:t>
-      </w:r>
-      <w:proofErr w:type="gramStart"/>
-      <w:r>
-        <w:t>Yes(</w:t>
+        <w:t>Enabled attribute to change its state to Yes(</w:t>
       </w:r>
       <w:r>
         <w:t xml:space="preserve"> </w:t>
@@ -673,7 +595,6 @@
       <w:r>
         <w:t>Enabled</w:t>
       </w:r>
-      <w:proofErr w:type="gramEnd"/>
       <w:r>
         <w:rPr>
           <w:b/>
@@ -878,14 +799,12 @@
       <w:r>
         <w:t xml:space="preserve">ake a note of the </w:t>
       </w:r>
-      <w:proofErr w:type="spellStart"/>
       <w:r>
         <w:rPr>
           <w:b/>
         </w:rPr>
         <w:t>IPAll</w:t>
       </w:r>
-      <w:proofErr w:type="spellEnd"/>
       <w:r>
         <w:t xml:space="preserve"> TCP port </w:t>
       </w:r>
@@ -906,21 +825,7 @@
           <w:b/>
         </w:rPr>
         <w:br/>
-        <w:t xml:space="preserve">(could be different) which you'll need when you construct a connection string in your Java code </w:t>
-      </w:r>
-      <w:proofErr w:type="gramStart"/>
-      <w:r>
-        <w:rPr>
-          <w:b/>
-        </w:rPr>
-        <w:t>later on</w:t>
-      </w:r>
-      <w:proofErr w:type="gramEnd"/>
-      <w:r>
-        <w:rPr>
-          <w:b/>
-        </w:rPr>
-        <w:t>.</w:t>
+        <w:t>(could be different) which you'll need when you construct a connection string in your Java code later on.</w:t>
       </w:r>
     </w:p>
     <w:p>
@@ -1011,15 +916,7 @@
         </w:numPr>
       </w:pPr>
       <w:r>
-        <w:t xml:space="preserve">Find the SQL Server </w:t>
-      </w:r>
-      <w:proofErr w:type="gramStart"/>
-      <w:r>
-        <w:t>service  and</w:t>
-      </w:r>
-      <w:proofErr w:type="gramEnd"/>
-      <w:r>
-        <w:t xml:space="preserve"> restart it</w:t>
+        <w:t>Find the SQL Server service  and restart it</w:t>
       </w:r>
     </w:p>
     <w:p>
@@ -1107,13 +1004,8 @@
       <w:pPr>
         <w:pStyle w:val="ListParagraph"/>
       </w:pPr>
-      <w:proofErr w:type="gramStart"/>
-      <w:r>
-        <w:t>Next</w:t>
-      </w:r>
-      <w:proofErr w:type="gramEnd"/>
-      <w:r>
-        <w:t xml:space="preserve"> we'll create a user for your application with enough rights to access a database of your choice.</w:t>
+      <w:r>
+        <w:t>Next we'll create a user for your application with enough rights to access a database of your choice.</w:t>
       </w:r>
     </w:p>
     <w:p>
@@ -1361,14 +1253,12 @@
       <w:r>
         <w:t xml:space="preserve">Select the </w:t>
       </w:r>
-      <w:proofErr w:type="spellStart"/>
       <w:r>
         <w:rPr>
           <w:b/>
         </w:rPr>
         <w:t>qastore</w:t>
       </w:r>
-      <w:proofErr w:type="spellEnd"/>
       <w:r>
         <w:t xml:space="preserve"> </w:t>
       </w:r>
@@ -1388,14 +1278,12 @@
         <w:br/>
         <w:t xml:space="preserve">Here we've selected </w:t>
       </w:r>
-      <w:proofErr w:type="spellStart"/>
       <w:r>
         <w:rPr>
           <w:b/>
         </w:rPr>
         <w:t>db_owner</w:t>
       </w:r>
-      <w:proofErr w:type="spellEnd"/>
       <w:r>
         <w:t xml:space="preserve"> rights but in real life you may select fewer rights.</w:t>
       </w:r>
@@ -1582,14 +1470,12 @@
       <w:r>
         <w:t xml:space="preserve">In this section you'll extract rows from the </w:t>
       </w:r>
-      <w:proofErr w:type="spellStart"/>
       <w:r>
         <w:rPr>
           <w:b/>
         </w:rPr>
         <w:t>qastore</w:t>
       </w:r>
-      <w:proofErr w:type="spellEnd"/>
       <w:r>
         <w:t xml:space="preserve"> database </w:t>
       </w:r>
@@ -1603,15 +1489,7 @@
         </w:numPr>
       </w:pPr>
       <w:r>
-        <w:t xml:space="preserve">Before you start </w:t>
-      </w:r>
-      <w:proofErr w:type="gramStart"/>
-      <w:r>
-        <w:t>coding</w:t>
-      </w:r>
-      <w:proofErr w:type="gramEnd"/>
-      <w:r>
-        <w:t xml:space="preserve"> you'll need the JDBC library which you can download</w:t>
+        <w:t>Before you start coding you'll need the JDBC library which you can download</w:t>
       </w:r>
       <w:r>
         <w:t xml:space="preserve"> by clicking here </w:t>
@@ -1682,15 +1560,7 @@
         <w:t>. Please follow the</w:t>
       </w:r>
       <w:r>
-        <w:t xml:space="preserve"> </w:t>
-      </w:r>
-      <w:proofErr w:type="gramStart"/>
-      <w:r>
-        <w:t>step by step</w:t>
-      </w:r>
-      <w:proofErr w:type="gramEnd"/>
-      <w:r>
-        <w:t xml:space="preserve"> instructions below.</w:t>
+        <w:t xml:space="preserve"> step by step instructions below.</w:t>
       </w:r>
     </w:p>
     <w:p>
@@ -2120,23 +1990,7 @@
         </w:numPr>
       </w:pPr>
       <w:r>
-        <w:t xml:space="preserve">Right </w:t>
-      </w:r>
-      <w:proofErr w:type="gramStart"/>
-      <w:r>
-        <w:t>mouse</w:t>
-      </w:r>
-      <w:proofErr w:type="gramEnd"/>
-      <w:r>
-        <w:t xml:space="preserve"> click on the </w:t>
-      </w:r>
-      <w:proofErr w:type="spellStart"/>
-      <w:r>
-        <w:t>src</w:t>
-      </w:r>
-      <w:proofErr w:type="spellEnd"/>
-      <w:r>
-        <w:t xml:space="preserve"> node and then select the </w:t>
+        <w:t xml:space="preserve">Right mouse click on the src node and then select the </w:t>
       </w:r>
       <w:r>
         <w:rPr>
@@ -2224,35 +2078,7 @@
         <w:rPr>
           <w:b/>
         </w:rPr>
-        <w:t xml:space="preserve">public static void </w:t>
-      </w:r>
-      <w:proofErr w:type="gramStart"/>
-      <w:r>
-        <w:rPr>
-          <w:b/>
-        </w:rPr>
-        <w:t>main(</w:t>
-      </w:r>
-      <w:proofErr w:type="gramEnd"/>
-      <w:r>
-        <w:rPr>
-          <w:b/>
-        </w:rPr>
-        <w:t xml:space="preserve">String[] </w:t>
-      </w:r>
-      <w:proofErr w:type="spellStart"/>
-      <w:r>
-        <w:rPr>
-          <w:b/>
-        </w:rPr>
-        <w:t>args</w:t>
-      </w:r>
-      <w:proofErr w:type="spellEnd"/>
-      <w:r>
-        <w:rPr>
-          <w:b/>
-        </w:rPr>
-        <w:t xml:space="preserve">) </w:t>
+        <w:t xml:space="preserve">public static void main(String[] args) </w:t>
       </w:r>
       <w:r>
         <w:t>check box.</w:t>
@@ -2349,24 +2175,14 @@
         </w:numPr>
       </w:pPr>
       <w:r>
-        <w:t xml:space="preserve">Right </w:t>
-      </w:r>
-      <w:proofErr w:type="gramStart"/>
-      <w:r>
-        <w:t>mouse</w:t>
-      </w:r>
-      <w:proofErr w:type="gramEnd"/>
-      <w:r>
-        <w:t xml:space="preserve"> click on your project (here is </w:t>
-      </w:r>
-      <w:proofErr w:type="spellStart"/>
+        <w:t xml:space="preserve">Right mouse click on your project (here is </w:t>
+      </w:r>
       <w:r>
         <w:rPr>
           <w:b/>
         </w:rPr>
         <w:t>qa</w:t>
       </w:r>
-      <w:proofErr w:type="spellEnd"/>
       <w:r>
         <w:t xml:space="preserve">) and then select </w:t>
       </w:r>
@@ -2531,7 +2347,6 @@
       <w:r>
         <w:t xml:space="preserve">Back in the </w:t>
       </w:r>
-      <w:proofErr w:type="spellStart"/>
       <w:r>
         <w:rPr>
           <w:b/>
@@ -2539,7 +2354,6 @@
         </w:rPr>
         <w:t>src</w:t>
       </w:r>
-      <w:proofErr w:type="spellEnd"/>
       <w:r>
         <w:rPr>
           <w:sz w:val="28"/>
@@ -2570,15 +2384,7 @@
         </w:numPr>
       </w:pPr>
       <w:r>
-        <w:t xml:space="preserve">Replace the </w:t>
-      </w:r>
-      <w:proofErr w:type="gramStart"/>
-      <w:r>
-        <w:t>main(</w:t>
-      </w:r>
-      <w:proofErr w:type="gramEnd"/>
-      <w:r>
-        <w:t>) method's code with</w:t>
+        <w:t>Replace the main() method's code with</w:t>
       </w:r>
       <w:r>
         <w:br/>
@@ -2652,7 +2458,6 @@
         </w:rPr>
         <w:t xml:space="preserve"> main(String[] </w:t>
       </w:r>
-      <w:proofErr w:type="spellStart"/>
       <w:r>
         <w:rPr>
           <w:rFonts w:ascii="Consolas" w:hAnsi="Consolas" w:cs="Consolas"/>
@@ -2662,7 +2467,6 @@
         </w:rPr>
         <w:t>args</w:t>
       </w:r>
-      <w:proofErr w:type="spellEnd"/>
       <w:r>
         <w:rPr>
           <w:rFonts w:ascii="Consolas" w:hAnsi="Consolas" w:cs="Consolas"/>
@@ -2717,7 +2521,6 @@
         </w:rPr>
         <w:t xml:space="preserve">String </w:t>
       </w:r>
-      <w:proofErr w:type="spellStart"/>
       <w:r>
         <w:rPr>
           <w:rFonts w:ascii="Consolas" w:hAnsi="Consolas" w:cs="Consolas"/>
@@ -2727,7 +2530,6 @@
         </w:rPr>
         <w:t>connectionUrl</w:t>
       </w:r>
-      <w:proofErr w:type="spellEnd"/>
       <w:r>
         <w:rPr>
           <w:rFonts w:ascii="Consolas" w:hAnsi="Consolas" w:cs="Consolas"/>
@@ -2744,10 +2546,17 @@
           <w:sz w:val="20"/>
           <w:szCs w:val="20"/>
         </w:rPr>
-        <w:t>"</w:t>
-      </w:r>
-      <w:proofErr w:type="spellStart"/>
-      <w:proofErr w:type="gramStart"/>
+        <w:t>"jdbc:sqlserver://localhost\\SQLEXPRESS:1433"</w:t>
+      </w:r>
+      <w:r>
+        <w:rPr>
+          <w:rFonts w:ascii="Consolas" w:hAnsi="Consolas" w:cs="Consolas"/>
+          <w:color w:val="000000"/>
+          <w:sz w:val="20"/>
+          <w:szCs w:val="20"/>
+        </w:rPr>
+        <w:t xml:space="preserve"> + </w:t>
+      </w:r>
       <w:r>
         <w:rPr>
           <w:rFonts w:ascii="Consolas" w:hAnsi="Consolas" w:cs="Consolas"/>
@@ -2755,105 +2564,7 @@
           <w:sz w:val="20"/>
           <w:szCs w:val="20"/>
         </w:rPr>
-        <w:t>jdbc:sqlserver</w:t>
-      </w:r>
-      <w:proofErr w:type="spellEnd"/>
-      <w:r>
-        <w:rPr>
-          <w:rFonts w:ascii="Consolas" w:hAnsi="Consolas" w:cs="Consolas"/>
-          <w:color w:val="2A00FF"/>
-          <w:sz w:val="20"/>
-          <w:szCs w:val="20"/>
-        </w:rPr>
-        <w:t>://localhost</w:t>
-      </w:r>
-      <w:proofErr w:type="gramEnd"/>
-      <w:r>
-        <w:rPr>
-          <w:rFonts w:ascii="Consolas" w:hAnsi="Consolas" w:cs="Consolas"/>
-          <w:color w:val="2A00FF"/>
-          <w:sz w:val="20"/>
-          <w:szCs w:val="20"/>
-        </w:rPr>
-        <w:t>\\SQLEXPRESS:1433"</w:t>
-      </w:r>
-      <w:r>
-        <w:rPr>
-          <w:rFonts w:ascii="Consolas" w:hAnsi="Consolas" w:cs="Consolas"/>
-          <w:color w:val="000000"/>
-          <w:sz w:val="20"/>
-          <w:szCs w:val="20"/>
-        </w:rPr>
-        <w:t xml:space="preserve"> + </w:t>
-      </w:r>
-      <w:r>
-        <w:rPr>
-          <w:rFonts w:ascii="Consolas" w:hAnsi="Consolas" w:cs="Consolas"/>
-          <w:color w:val="2A00FF"/>
-          <w:sz w:val="20"/>
-          <w:szCs w:val="20"/>
-        </w:rPr>
-        <w:t>";</w:t>
-      </w:r>
-      <w:proofErr w:type="spellStart"/>
-      <w:r>
-        <w:rPr>
-          <w:rFonts w:ascii="Consolas" w:hAnsi="Consolas" w:cs="Consolas"/>
-          <w:color w:val="2A00FF"/>
-          <w:sz w:val="20"/>
-          <w:szCs w:val="20"/>
-        </w:rPr>
-        <w:t>databaseName</w:t>
-      </w:r>
-      <w:proofErr w:type="spellEnd"/>
-      <w:r>
-        <w:rPr>
-          <w:rFonts w:ascii="Consolas" w:hAnsi="Consolas" w:cs="Consolas"/>
-          <w:color w:val="2A00FF"/>
-          <w:sz w:val="20"/>
-          <w:szCs w:val="20"/>
-        </w:rPr>
-        <w:t>=</w:t>
-      </w:r>
-      <w:proofErr w:type="spellStart"/>
-      <w:r>
-        <w:rPr>
-          <w:rFonts w:ascii="Consolas" w:hAnsi="Consolas" w:cs="Consolas"/>
-          <w:color w:val="2A00FF"/>
-          <w:sz w:val="20"/>
-          <w:szCs w:val="20"/>
-        </w:rPr>
-        <w:t>qastore;user</w:t>
-      </w:r>
-      <w:proofErr w:type="spellEnd"/>
-      <w:r>
-        <w:rPr>
-          <w:rFonts w:ascii="Consolas" w:hAnsi="Consolas" w:cs="Consolas"/>
-          <w:color w:val="2A00FF"/>
-          <w:sz w:val="20"/>
-          <w:szCs w:val="20"/>
-        </w:rPr>
-        <w:t>=</w:t>
-      </w:r>
-      <w:proofErr w:type="spellStart"/>
-      <w:r>
-        <w:rPr>
-          <w:rFonts w:ascii="Consolas" w:hAnsi="Consolas" w:cs="Consolas"/>
-          <w:color w:val="2A00FF"/>
-          <w:sz w:val="20"/>
-          <w:szCs w:val="20"/>
-        </w:rPr>
-        <w:t>bob;password</w:t>
-      </w:r>
-      <w:proofErr w:type="spellEnd"/>
-      <w:r>
-        <w:rPr>
-          <w:rFonts w:ascii="Consolas" w:hAnsi="Consolas" w:cs="Consolas"/>
-          <w:color w:val="2A00FF"/>
-          <w:sz w:val="20"/>
-          <w:szCs w:val="20"/>
-        </w:rPr>
-        <w:t>=password123"</w:t>
+        <w:t>";databaseName=qastore;user=bob;password=password123"</w:t>
       </w:r>
       <w:r>
         <w:rPr>
@@ -2896,7 +2607,6 @@
         </w:rPr>
         <w:t xml:space="preserve">Connection </w:t>
       </w:r>
-      <w:proofErr w:type="spellStart"/>
       <w:r>
         <w:rPr>
           <w:rFonts w:ascii="Consolas" w:hAnsi="Consolas" w:cs="Consolas"/>
@@ -2906,7 +2616,6 @@
         </w:rPr>
         <w:t>connection</w:t>
       </w:r>
-      <w:proofErr w:type="spellEnd"/>
       <w:r>
         <w:rPr>
           <w:rFonts w:ascii="Consolas" w:hAnsi="Consolas" w:cs="Consolas"/>
@@ -2914,40 +2623,28 @@
           <w:sz w:val="20"/>
           <w:szCs w:val="20"/>
         </w:rPr>
-        <w:t xml:space="preserve"> = </w:t>
-      </w:r>
-      <w:proofErr w:type="spellStart"/>
-      <w:r>
-        <w:rPr>
-          <w:rFonts w:ascii="Consolas" w:hAnsi="Consolas" w:cs="Consolas"/>
+        <w:t xml:space="preserve"> = DriverManager.</w:t>
+      </w:r>
+      <w:r>
+        <w:rPr>
+          <w:rFonts w:ascii="Consolas" w:hAnsi="Consolas" w:cs="Consolas"/>
+          <w:i/>
+          <w:iCs/>
           <w:color w:val="000000"/>
           <w:sz w:val="20"/>
           <w:szCs w:val="20"/>
         </w:rPr>
-        <w:t>DriverManager.</w:t>
-      </w:r>
-      <w:r>
-        <w:rPr>
-          <w:rFonts w:ascii="Consolas" w:hAnsi="Consolas" w:cs="Consolas"/>
-          <w:i/>
-          <w:iCs/>
+        <w:t>getConnection</w:t>
+      </w:r>
+      <w:r>
+        <w:rPr>
+          <w:rFonts w:ascii="Consolas" w:hAnsi="Consolas" w:cs="Consolas"/>
           <w:color w:val="000000"/>
           <w:sz w:val="20"/>
           <w:szCs w:val="20"/>
         </w:rPr>
-        <w:t>getConnection</w:t>
-      </w:r>
-      <w:proofErr w:type="spellEnd"/>
-      <w:r>
-        <w:rPr>
-          <w:rFonts w:ascii="Consolas" w:hAnsi="Consolas" w:cs="Consolas"/>
-          <w:color w:val="000000"/>
-          <w:sz w:val="20"/>
-          <w:szCs w:val="20"/>
-        </w:rPr>
         <w:t>(</w:t>
       </w:r>
-      <w:proofErr w:type="spellStart"/>
       <w:r>
         <w:rPr>
           <w:rFonts w:ascii="Consolas" w:hAnsi="Consolas" w:cs="Consolas"/>
@@ -2957,8 +2654,6 @@
         </w:rPr>
         <w:t>connectionUrl</w:t>
       </w:r>
-      <w:proofErr w:type="spellEnd"/>
-      <w:proofErr w:type="gramStart"/>
       <w:r>
         <w:rPr>
           <w:rFonts w:ascii="Consolas" w:hAnsi="Consolas" w:cs="Consolas"/>
@@ -2968,7 +2663,6 @@
         </w:rPr>
         <w:t>);</w:t>
       </w:r>
-      <w:proofErr w:type="gramEnd"/>
     </w:p>
     <w:p>
       <w:pPr>
@@ -3001,7 +2695,6 @@
         <w:tab/>
         <w:t xml:space="preserve">String </w:t>
       </w:r>
-      <w:proofErr w:type="spellStart"/>
       <w:r>
         <w:rPr>
           <w:rFonts w:ascii="Consolas" w:hAnsi="Consolas" w:cs="Consolas"/>
@@ -3011,7 +2704,6 @@
         </w:rPr>
         <w:t>sql</w:t>
       </w:r>
-      <w:proofErr w:type="spellEnd"/>
       <w:r>
         <w:rPr>
           <w:rFonts w:ascii="Consolas" w:hAnsi="Consolas" w:cs="Consolas"/>
@@ -3028,9 +2720,8 @@
           <w:sz w:val="20"/>
           <w:szCs w:val="20"/>
         </w:rPr>
-        <w:t xml:space="preserve">"SELECT </w:t>
-      </w:r>
-      <w:proofErr w:type="spellStart"/>
+        <w:t>"SELECT company_name FROM company</w:t>
+      </w:r>
       <w:r>
         <w:rPr>
           <w:rFonts w:ascii="Consolas" w:hAnsi="Consolas" w:cs="Consolas"/>
@@ -3038,46 +2729,7 @@
           <w:sz w:val="20"/>
           <w:szCs w:val="20"/>
         </w:rPr>
-        <w:t>company_name</w:t>
-      </w:r>
-      <w:proofErr w:type="spellEnd"/>
-      <w:r>
-        <w:rPr>
-          <w:rFonts w:ascii="Consolas" w:hAnsi="Consolas" w:cs="Consolas"/>
-          <w:color w:val="2A00FF"/>
-          <w:sz w:val="20"/>
-          <w:szCs w:val="20"/>
-        </w:rPr>
-        <w:t xml:space="preserve"> FROM company</w:t>
-      </w:r>
-      <w:proofErr w:type="gramStart"/>
-      <w:r>
-        <w:rPr>
-          <w:rFonts w:ascii="Consolas" w:hAnsi="Consolas" w:cs="Consolas"/>
-          <w:color w:val="2A00FF"/>
-          <w:sz w:val="20"/>
-          <w:szCs w:val="20"/>
-        </w:rPr>
-        <w:t>"</w:t>
-      </w:r>
-      <w:r>
-        <w:rPr>
-          <w:rFonts w:ascii="Consolas" w:hAnsi="Consolas" w:cs="Consolas"/>
-          <w:color w:val="2A00FF"/>
-          <w:sz w:val="20"/>
-          <w:szCs w:val="20"/>
-        </w:rPr>
-        <w:t>;</w:t>
-      </w:r>
-      <w:proofErr w:type="gramEnd"/>
-      <w:r>
-        <w:rPr>
-          <w:rFonts w:ascii="Consolas" w:hAnsi="Consolas" w:cs="Consolas"/>
-          <w:color w:val="2A00FF"/>
-          <w:sz w:val="20"/>
-          <w:szCs w:val="20"/>
-        </w:rPr>
-        <w:t xml:space="preserve"> </w:t>
+        <w:t xml:space="preserve">"; </w:t>
       </w:r>
     </w:p>
     <w:p>
@@ -3124,7 +2776,6 @@
         <w:tab/>
         <w:t xml:space="preserve">Statement </w:t>
       </w:r>
-      <w:proofErr w:type="spellStart"/>
       <w:r>
         <w:rPr>
           <w:rFonts w:ascii="Consolas" w:hAnsi="Consolas" w:cs="Consolas"/>
@@ -3134,7 +2785,6 @@
         </w:rPr>
         <w:t>statement</w:t>
       </w:r>
-      <w:proofErr w:type="spellEnd"/>
       <w:r>
         <w:rPr>
           <w:rFonts w:ascii="Consolas" w:hAnsi="Consolas" w:cs="Consolas"/>
@@ -3144,8 +2794,6 @@
         </w:rPr>
         <w:t xml:space="preserve"> = </w:t>
       </w:r>
-      <w:proofErr w:type="spellStart"/>
-      <w:proofErr w:type="gramStart"/>
       <w:r>
         <w:rPr>
           <w:rFonts w:ascii="Consolas" w:hAnsi="Consolas" w:cs="Consolas"/>
@@ -3162,18 +2810,7 @@
           <w:sz w:val="20"/>
           <w:szCs w:val="20"/>
         </w:rPr>
-        <w:t>.createStatement</w:t>
-      </w:r>
-      <w:proofErr w:type="spellEnd"/>
-      <w:proofErr w:type="gramEnd"/>
-      <w:r>
-        <w:rPr>
-          <w:rFonts w:ascii="Consolas" w:hAnsi="Consolas" w:cs="Consolas"/>
-          <w:color w:val="000000"/>
-          <w:sz w:val="20"/>
-          <w:szCs w:val="20"/>
-        </w:rPr>
-        <w:t>() ;</w:t>
+        <w:t>.createStatement() ;</w:t>
       </w:r>
     </w:p>
     <w:p>
@@ -3205,28 +2842,8 @@
           <w:szCs w:val="20"/>
         </w:rPr>
         <w:tab/>
-      </w:r>
-      <w:proofErr w:type="spellStart"/>
-      <w:r>
-        <w:rPr>
-          <w:rFonts w:ascii="Consolas" w:hAnsi="Consolas" w:cs="Consolas"/>
-          <w:color w:val="000000"/>
-          <w:sz w:val="20"/>
-          <w:szCs w:val="20"/>
-        </w:rPr>
-        <w:t>ResultSet</w:t>
-      </w:r>
-      <w:proofErr w:type="spellEnd"/>
-      <w:r>
-        <w:rPr>
-          <w:rFonts w:ascii="Consolas" w:hAnsi="Consolas" w:cs="Consolas"/>
-          <w:color w:val="000000"/>
-          <w:sz w:val="20"/>
-          <w:szCs w:val="20"/>
-        </w:rPr>
-        <w:t xml:space="preserve"> </w:t>
-      </w:r>
-      <w:proofErr w:type="spellStart"/>
+        <w:t xml:space="preserve">ResultSet </w:t>
+      </w:r>
       <w:r>
         <w:rPr>
           <w:rFonts w:ascii="Consolas" w:hAnsi="Consolas" w:cs="Consolas"/>
@@ -3237,7 +2854,6 @@
         </w:rPr>
         <w:t>resultSet</w:t>
       </w:r>
-      <w:proofErr w:type="spellEnd"/>
       <w:r>
         <w:rPr>
           <w:rFonts w:ascii="Consolas" w:hAnsi="Consolas" w:cs="Consolas"/>
@@ -3247,8 +2863,6 @@
         </w:rPr>
         <w:t xml:space="preserve"> = </w:t>
       </w:r>
-      <w:proofErr w:type="spellStart"/>
-      <w:proofErr w:type="gramStart"/>
       <w:r>
         <w:rPr>
           <w:rFonts w:ascii="Consolas" w:hAnsi="Consolas" w:cs="Consolas"/>
@@ -3265,20 +2879,8 @@
           <w:sz w:val="20"/>
           <w:szCs w:val="20"/>
         </w:rPr>
-        <w:t>.executeQuery</w:t>
-      </w:r>
-      <w:proofErr w:type="spellEnd"/>
-      <w:proofErr w:type="gramEnd"/>
-      <w:r>
-        <w:rPr>
-          <w:rFonts w:ascii="Consolas" w:hAnsi="Consolas" w:cs="Consolas"/>
-          <w:color w:val="000000"/>
-          <w:sz w:val="20"/>
-          <w:szCs w:val="20"/>
-        </w:rPr>
-        <w:t>(</w:t>
-      </w:r>
-      <w:proofErr w:type="spellStart"/>
+        <w:t>.executeQuery(</w:t>
+      </w:r>
       <w:r>
         <w:rPr>
           <w:rFonts w:ascii="Consolas" w:hAnsi="Consolas" w:cs="Consolas"/>
@@ -3288,7 +2890,6 @@
         </w:rPr>
         <w:t>sql</w:t>
       </w:r>
-      <w:proofErr w:type="spellEnd"/>
       <w:r>
         <w:rPr>
           <w:rFonts w:ascii="Consolas" w:hAnsi="Consolas" w:cs="Consolas"/>
@@ -3378,19 +2979,8 @@
           <w:sz w:val="20"/>
           <w:szCs w:val="20"/>
         </w:rPr>
-        <w:t xml:space="preserve"> </w:t>
-      </w:r>
-      <w:proofErr w:type="gramStart"/>
-      <w:r>
-        <w:rPr>
-          <w:rFonts w:ascii="Consolas" w:hAnsi="Consolas" w:cs="Consolas"/>
-          <w:color w:val="000000"/>
-          <w:sz w:val="20"/>
-          <w:szCs w:val="20"/>
-        </w:rPr>
-        <w:t xml:space="preserve">( </w:t>
-      </w:r>
-      <w:proofErr w:type="spellStart"/>
+        <w:t xml:space="preserve"> ( </w:t>
+      </w:r>
       <w:r>
         <w:rPr>
           <w:rFonts w:ascii="Consolas" w:hAnsi="Consolas" w:cs="Consolas"/>
@@ -3408,18 +2998,7 @@
           <w:sz w:val="20"/>
           <w:szCs w:val="20"/>
         </w:rPr>
-        <w:t>.next</w:t>
-      </w:r>
-      <w:proofErr w:type="spellEnd"/>
-      <w:proofErr w:type="gramEnd"/>
-      <w:r>
-        <w:rPr>
-          <w:rFonts w:ascii="Consolas" w:hAnsi="Consolas" w:cs="Consolas"/>
-          <w:color w:val="000000"/>
-          <w:sz w:val="20"/>
-          <w:szCs w:val="20"/>
-        </w:rPr>
-        <w:t>() ){</w:t>
+        <w:t>.next() ){</w:t>
       </w:r>
     </w:p>
     <w:p>
@@ -3460,15 +3039,6 @@
           <w:szCs w:val="20"/>
         </w:rPr>
         <w:tab/>
-      </w:r>
-      <w:proofErr w:type="spellStart"/>
-      <w:r>
-        <w:rPr>
-          <w:rFonts w:ascii="Consolas" w:hAnsi="Consolas" w:cs="Consolas"/>
-          <w:color w:val="000000"/>
-          <w:sz w:val="20"/>
-          <w:szCs w:val="20"/>
-        </w:rPr>
         <w:t>System.</w:t>
       </w:r>
       <w:r>
@@ -3491,20 +3061,8 @@
           <w:sz w:val="20"/>
           <w:szCs w:val="20"/>
         </w:rPr>
-        <w:t>.println</w:t>
-      </w:r>
-      <w:proofErr w:type="spellEnd"/>
-      <w:proofErr w:type="gramStart"/>
-      <w:r>
-        <w:rPr>
-          <w:rFonts w:ascii="Consolas" w:hAnsi="Consolas" w:cs="Consolas"/>
-          <w:color w:val="000000"/>
-          <w:sz w:val="20"/>
-          <w:szCs w:val="20"/>
-        </w:rPr>
-        <w:t xml:space="preserve">( </w:t>
-      </w:r>
-      <w:proofErr w:type="spellStart"/>
+        <w:t xml:space="preserve">.println( </w:t>
+      </w:r>
       <w:r>
         <w:rPr>
           <w:rFonts w:ascii="Consolas" w:hAnsi="Consolas" w:cs="Consolas"/>
@@ -3522,18 +3080,7 @@
           <w:sz w:val="20"/>
           <w:szCs w:val="20"/>
         </w:rPr>
-        <w:t>.getString</w:t>
-      </w:r>
-      <w:proofErr w:type="spellEnd"/>
-      <w:proofErr w:type="gramEnd"/>
-      <w:r>
-        <w:rPr>
-          <w:rFonts w:ascii="Consolas" w:hAnsi="Consolas" w:cs="Consolas"/>
-          <w:color w:val="000000"/>
-          <w:sz w:val="20"/>
-          <w:szCs w:val="20"/>
-        </w:rPr>
-        <w:t>(1));</w:t>
+        <w:t>.getString(1));</w:t>
       </w:r>
     </w:p>
     <w:p>
@@ -3592,8 +3139,6 @@
         </w:rPr>
         <w:t xml:space="preserve">   </w:t>
       </w:r>
-      <w:proofErr w:type="spellStart"/>
-      <w:proofErr w:type="gramStart"/>
       <w:r>
         <w:rPr>
           <w:rFonts w:ascii="Consolas" w:hAnsi="Consolas" w:cs="Consolas"/>
@@ -3610,18 +3155,7 @@
           <w:szCs w:val="20"/>
           <w:shd w:val="clear" w:color="auto" w:fill="E8F2FE"/>
         </w:rPr>
-        <w:t>.close</w:t>
-      </w:r>
-      <w:proofErr w:type="spellEnd"/>
-      <w:proofErr w:type="gramEnd"/>
-      <w:r>
-        <w:rPr>
-          <w:rFonts w:ascii="Consolas" w:hAnsi="Consolas" w:cs="Consolas"/>
-          <w:color w:val="000000"/>
-          <w:szCs w:val="20"/>
-          <w:shd w:val="clear" w:color="auto" w:fill="E8F2FE"/>
-        </w:rPr>
-        <w:t>();</w:t>
+        <w:t>.close();</w:t>
       </w:r>
     </w:p>
     <w:p>
@@ -3703,20 +3237,7 @@
       </w:r>
       <w:r>
         <w:br/>
-        <w:t>You can now double click the option "Import 'Connection' (</w:t>
-      </w:r>
-      <w:proofErr w:type="spellStart"/>
-      <w:proofErr w:type="gramStart"/>
-      <w:r>
-        <w:t>java.sql</w:t>
-      </w:r>
-      <w:proofErr w:type="spellEnd"/>
-      <w:r>
-        <w:t>)…</w:t>
-      </w:r>
-      <w:proofErr w:type="gramEnd"/>
-      <w:r>
-        <w:t>"  to resolve the Connection error.</w:t>
+        <w:t>You can now double click the option "Import 'Connection' (java.sql)…"  to resolve the Connection error.</w:t>
       </w:r>
       <w:r>
         <w:br/>
@@ -3860,7 +3381,6 @@
         <w:br/>
         <w:t xml:space="preserve">Right mouse click on the </w:t>
       </w:r>
-      <w:proofErr w:type="spellStart"/>
       <w:r>
         <w:rPr>
           <w:b/>
@@ -3868,7 +3388,6 @@
         </w:rPr>
         <w:t>src</w:t>
       </w:r>
-      <w:proofErr w:type="spellEnd"/>
       <w:r>
         <w:rPr>
           <w:sz w:val="24"/>
@@ -4083,7 +3602,6 @@
         <w:tab/>
         <w:t xml:space="preserve">String </w:t>
       </w:r>
-      <w:proofErr w:type="spellStart"/>
       <w:r>
         <w:rPr>
           <w:rFonts w:ascii="Consolas" w:hAnsi="Consolas" w:cs="Consolas"/>
@@ -4093,7 +3611,6 @@
         </w:rPr>
         <w:t>sql</w:t>
       </w:r>
-      <w:proofErr w:type="spellEnd"/>
       <w:r>
         <w:rPr>
           <w:rFonts w:ascii="Consolas" w:hAnsi="Consolas" w:cs="Consolas"/>
@@ -4211,7 +3728,6 @@
         </w:rPr>
         <w:t>'London'</w:t>
       </w:r>
-      <w:proofErr w:type="gramStart"/>
       <w:r>
         <w:rPr>
           <w:rFonts w:ascii="Consolas" w:hAnsi="Consolas" w:cs="Consolas"/>
@@ -4230,7 +3746,6 @@
         </w:rPr>
         <w:t xml:space="preserve"> ;</w:t>
       </w:r>
-      <w:proofErr w:type="gramEnd"/>
     </w:p>
     <w:p>
       <w:pPr>
@@ -4271,7 +3786,6 @@
         <w:tab/>
         <w:t xml:space="preserve">Statement </w:t>
       </w:r>
-      <w:proofErr w:type="spellStart"/>
       <w:r>
         <w:rPr>
           <w:rFonts w:ascii="Consolas" w:hAnsi="Consolas" w:cs="Consolas"/>
@@ -4281,7 +3795,6 @@
         </w:rPr>
         <w:t>statement</w:t>
       </w:r>
-      <w:proofErr w:type="spellEnd"/>
       <w:r>
         <w:rPr>
           <w:rFonts w:ascii="Consolas" w:hAnsi="Consolas" w:cs="Consolas"/>
@@ -4291,8 +3804,6 @@
         </w:rPr>
         <w:t xml:space="preserve"> = </w:t>
       </w:r>
-      <w:proofErr w:type="spellStart"/>
-      <w:proofErr w:type="gramStart"/>
       <w:r>
         <w:rPr>
           <w:rFonts w:ascii="Consolas" w:hAnsi="Consolas" w:cs="Consolas"/>
@@ -4309,18 +3820,7 @@
           <w:sz w:val="24"/>
           <w:szCs w:val="24"/>
         </w:rPr>
-        <w:t>.createStatement</w:t>
-      </w:r>
-      <w:proofErr w:type="spellEnd"/>
-      <w:proofErr w:type="gramEnd"/>
-      <w:r>
-        <w:rPr>
-          <w:rFonts w:ascii="Consolas" w:hAnsi="Consolas" w:cs="Consolas"/>
-          <w:color w:val="000000"/>
-          <w:sz w:val="24"/>
-          <w:szCs w:val="24"/>
-        </w:rPr>
-        <w:t>() ;</w:t>
+        <w:t>.createStatement() ;</w:t>
       </w:r>
     </w:p>
     <w:p>
@@ -4345,28 +3845,8 @@
           <w:szCs w:val="24"/>
         </w:rPr>
         <w:tab/>
-      </w:r>
-      <w:proofErr w:type="spellStart"/>
-      <w:r>
-        <w:rPr>
-          <w:rFonts w:ascii="Consolas" w:hAnsi="Consolas" w:cs="Consolas"/>
-          <w:color w:val="000000"/>
-          <w:sz w:val="24"/>
-          <w:szCs w:val="24"/>
-        </w:rPr>
-        <w:t>ResultSet</w:t>
-      </w:r>
-      <w:proofErr w:type="spellEnd"/>
-      <w:r>
-        <w:rPr>
-          <w:rFonts w:ascii="Consolas" w:hAnsi="Consolas" w:cs="Consolas"/>
-          <w:color w:val="000000"/>
-          <w:sz w:val="24"/>
-          <w:szCs w:val="24"/>
-        </w:rPr>
-        <w:t xml:space="preserve"> </w:t>
-      </w:r>
-      <w:proofErr w:type="spellStart"/>
+        <w:t xml:space="preserve">ResultSet </w:t>
+      </w:r>
       <w:r>
         <w:rPr>
           <w:rFonts w:ascii="Consolas" w:hAnsi="Consolas" w:cs="Consolas"/>
@@ -4376,7 +3856,6 @@
         </w:rPr>
         <w:t>resultSet</w:t>
       </w:r>
-      <w:proofErr w:type="spellEnd"/>
       <w:r>
         <w:rPr>
           <w:rFonts w:ascii="Consolas" w:hAnsi="Consolas" w:cs="Consolas"/>
@@ -4386,8 +3865,6 @@
         </w:rPr>
         <w:t xml:space="preserve"> = </w:t>
       </w:r>
-      <w:proofErr w:type="spellStart"/>
-      <w:proofErr w:type="gramStart"/>
       <w:r>
         <w:rPr>
           <w:rFonts w:ascii="Consolas" w:hAnsi="Consolas" w:cs="Consolas"/>
@@ -4404,20 +3881,8 @@
           <w:sz w:val="24"/>
           <w:szCs w:val="24"/>
         </w:rPr>
-        <w:t>.executeQuery</w:t>
-      </w:r>
-      <w:proofErr w:type="spellEnd"/>
-      <w:proofErr w:type="gramEnd"/>
-      <w:r>
-        <w:rPr>
-          <w:rFonts w:ascii="Consolas" w:hAnsi="Consolas" w:cs="Consolas"/>
-          <w:color w:val="000000"/>
-          <w:sz w:val="24"/>
-          <w:szCs w:val="24"/>
-        </w:rPr>
-        <w:t>(</w:t>
-      </w:r>
-      <w:proofErr w:type="spellStart"/>
+        <w:t>.executeQuery(</w:t>
+      </w:r>
       <w:r>
         <w:rPr>
           <w:rFonts w:ascii="Consolas" w:hAnsi="Consolas" w:cs="Consolas"/>
@@ -4427,7 +3892,6 @@
         </w:rPr>
         <w:t>sql</w:t>
       </w:r>
-      <w:proofErr w:type="spellEnd"/>
       <w:r>
         <w:rPr>
           <w:rFonts w:ascii="Consolas" w:hAnsi="Consolas" w:cs="Consolas"/>
@@ -4461,7 +3925,6 @@
         </w:rPr>
         <w:tab/>
       </w:r>
-      <w:proofErr w:type="spellStart"/>
       <w:r>
         <w:rPr>
           <w:rFonts w:ascii="Consolas" w:hAnsi="Consolas" w:cs="Consolas"/>
@@ -4478,17 +3941,7 @@
           <w:sz w:val="24"/>
           <w:szCs w:val="24"/>
         </w:rPr>
-        <w:t>.setFetchSize</w:t>
-      </w:r>
-      <w:proofErr w:type="spellEnd"/>
-      <w:r>
-        <w:rPr>
-          <w:rFonts w:ascii="Consolas" w:hAnsi="Consolas" w:cs="Consolas"/>
-          <w:color w:val="000000"/>
-          <w:sz w:val="24"/>
-          <w:szCs w:val="24"/>
-        </w:rPr>
-        <w:t xml:space="preserve">(2); </w:t>
+        <w:t xml:space="preserve">.setFetchSize(2); </w:t>
       </w:r>
       <w:r>
         <w:rPr>
@@ -4575,7 +4028,6 @@
         </w:rPr>
         <w:t xml:space="preserve">, </w:t>
       </w:r>
-      <w:proofErr w:type="gramStart"/>
       <w:r>
         <w:rPr>
           <w:rFonts w:ascii="Consolas" w:hAnsi="Consolas" w:cs="Consolas"/>
@@ -4594,7 +4046,6 @@
         </w:rPr>
         <w:t>;</w:t>
       </w:r>
-      <w:proofErr w:type="gramEnd"/>
     </w:p>
     <w:p>
       <w:pPr>
@@ -4656,27 +4107,7 @@
           <w:sz w:val="24"/>
           <w:szCs w:val="24"/>
         </w:rPr>
-        <w:t xml:space="preserve"> </w:t>
-      </w:r>
-      <w:proofErr w:type="gramStart"/>
-      <w:r>
-        <w:rPr>
-          <w:rFonts w:ascii="Consolas" w:hAnsi="Consolas" w:cs="Consolas"/>
-          <w:color w:val="000000"/>
-          <w:sz w:val="24"/>
-          <w:szCs w:val="24"/>
-        </w:rPr>
-        <w:t>StringBuilder(</w:t>
-      </w:r>
-      <w:proofErr w:type="gramEnd"/>
-      <w:r>
-        <w:rPr>
-          <w:rFonts w:ascii="Consolas" w:hAnsi="Consolas" w:cs="Consolas"/>
-          <w:color w:val="000000"/>
-          <w:sz w:val="24"/>
-          <w:szCs w:val="24"/>
-        </w:rPr>
-        <w:t>) ;</w:t>
+        <w:t xml:space="preserve"> StringBuilder() ;</w:t>
       </w:r>
     </w:p>
     <w:p>
@@ -4720,19 +4151,8 @@
           <w:sz w:val="24"/>
           <w:szCs w:val="24"/>
         </w:rPr>
-        <w:t xml:space="preserve"> </w:t>
-      </w:r>
-      <w:proofErr w:type="gramStart"/>
-      <w:r>
-        <w:rPr>
-          <w:rFonts w:ascii="Consolas" w:hAnsi="Consolas" w:cs="Consolas"/>
-          <w:color w:val="000000"/>
-          <w:sz w:val="24"/>
-          <w:szCs w:val="24"/>
-        </w:rPr>
-        <w:t xml:space="preserve">( </w:t>
-      </w:r>
-      <w:proofErr w:type="spellStart"/>
+        <w:t xml:space="preserve"> ( </w:t>
+      </w:r>
       <w:r>
         <w:rPr>
           <w:rFonts w:ascii="Consolas" w:hAnsi="Consolas" w:cs="Consolas"/>
@@ -4749,18 +4169,7 @@
           <w:sz w:val="24"/>
           <w:szCs w:val="24"/>
         </w:rPr>
-        <w:t>.next</w:t>
-      </w:r>
-      <w:proofErr w:type="spellEnd"/>
-      <w:proofErr w:type="gramEnd"/>
-      <w:r>
-        <w:rPr>
-          <w:rFonts w:ascii="Consolas" w:hAnsi="Consolas" w:cs="Consolas"/>
-          <w:color w:val="000000"/>
-          <w:sz w:val="24"/>
-          <w:szCs w:val="24"/>
-        </w:rPr>
-        <w:t>() ){</w:t>
+        <w:t>.next() ){</w:t>
       </w:r>
     </w:p>
     <w:p>
@@ -4805,7 +4214,6 @@
         </w:rPr>
         <w:t xml:space="preserve"> = </w:t>
       </w:r>
-      <w:proofErr w:type="spellStart"/>
       <w:r>
         <w:rPr>
           <w:rFonts w:ascii="Consolas" w:hAnsi="Consolas" w:cs="Consolas"/>
@@ -4822,29 +4230,8 @@
           <w:sz w:val="24"/>
           <w:szCs w:val="24"/>
         </w:rPr>
-        <w:t>.getString</w:t>
-      </w:r>
-      <w:proofErr w:type="spellEnd"/>
-      <w:r>
-        <w:rPr>
-          <w:rFonts w:ascii="Consolas" w:hAnsi="Consolas" w:cs="Consolas"/>
-          <w:color w:val="000000"/>
-          <w:sz w:val="24"/>
-          <w:szCs w:val="24"/>
-        </w:rPr>
-        <w:t>(1</w:t>
-      </w:r>
-      <w:proofErr w:type="gramStart"/>
-      <w:r>
-        <w:rPr>
-          <w:rFonts w:ascii="Consolas" w:hAnsi="Consolas" w:cs="Consolas"/>
-          <w:color w:val="000000"/>
-          <w:sz w:val="24"/>
-          <w:szCs w:val="24"/>
-        </w:rPr>
-        <w:t>);</w:t>
-      </w:r>
-      <w:proofErr w:type="gramEnd"/>
+        <w:t>.getString(1);</w:t>
+      </w:r>
     </w:p>
     <w:p>
       <w:pPr>
@@ -4888,7 +4275,6 @@
         </w:rPr>
         <w:t xml:space="preserve"> = </w:t>
       </w:r>
-      <w:proofErr w:type="spellStart"/>
       <w:r>
         <w:rPr>
           <w:rFonts w:ascii="Consolas" w:hAnsi="Consolas" w:cs="Consolas"/>
@@ -4905,29 +4291,8 @@
           <w:sz w:val="24"/>
           <w:szCs w:val="24"/>
         </w:rPr>
-        <w:t>.getString</w:t>
-      </w:r>
-      <w:proofErr w:type="spellEnd"/>
-      <w:r>
-        <w:rPr>
-          <w:rFonts w:ascii="Consolas" w:hAnsi="Consolas" w:cs="Consolas"/>
-          <w:color w:val="000000"/>
-          <w:sz w:val="24"/>
-          <w:szCs w:val="24"/>
-        </w:rPr>
-        <w:t>(2</w:t>
-      </w:r>
-      <w:proofErr w:type="gramStart"/>
-      <w:r>
-        <w:rPr>
-          <w:rFonts w:ascii="Consolas" w:hAnsi="Consolas" w:cs="Consolas"/>
-          <w:color w:val="000000"/>
-          <w:sz w:val="24"/>
-          <w:szCs w:val="24"/>
-        </w:rPr>
-        <w:t>) ;</w:t>
-      </w:r>
-      <w:proofErr w:type="gramEnd"/>
+        <w:t>.getString(2) ;</w:t>
+      </w:r>
     </w:p>
     <w:p>
       <w:pPr>
@@ -4971,7 +4336,6 @@
         </w:rPr>
         <w:t xml:space="preserve"> = </w:t>
       </w:r>
-      <w:proofErr w:type="spellStart"/>
       <w:r>
         <w:rPr>
           <w:rFonts w:ascii="Consolas" w:hAnsi="Consolas" w:cs="Consolas"/>
@@ -4988,17 +4352,7 @@
           <w:sz w:val="24"/>
           <w:szCs w:val="24"/>
         </w:rPr>
-        <w:t>.getString</w:t>
-      </w:r>
-      <w:proofErr w:type="spellEnd"/>
-      <w:r>
-        <w:rPr>
-          <w:rFonts w:ascii="Consolas" w:hAnsi="Consolas" w:cs="Consolas"/>
-          <w:color w:val="000000"/>
-          <w:sz w:val="24"/>
-          <w:szCs w:val="24"/>
-        </w:rPr>
-        <w:t>(</w:t>
+        <w:t>.getString(</w:t>
       </w:r>
       <w:r>
         <w:rPr>
@@ -5027,7 +4381,6 @@
         </w:rPr>
         <w:t>"</w:t>
       </w:r>
-      <w:proofErr w:type="gramStart"/>
       <w:r>
         <w:rPr>
           <w:rFonts w:ascii="Consolas" w:hAnsi="Consolas" w:cs="Consolas"/>
@@ -5037,7 +4390,6 @@
         </w:rPr>
         <w:t>) ;</w:t>
       </w:r>
-      <w:proofErr w:type="gramEnd"/>
     </w:p>
     <w:p>
       <w:pPr>
@@ -5063,8 +4415,6 @@
         <w:tab/>
         <w:t xml:space="preserve">   </w:t>
       </w:r>
-      <w:proofErr w:type="spellStart"/>
-      <w:proofErr w:type="gramStart"/>
       <w:r>
         <w:rPr>
           <w:rFonts w:ascii="Consolas" w:hAnsi="Consolas" w:cs="Consolas"/>
@@ -5081,28 +4431,7 @@
           <w:sz w:val="24"/>
           <w:szCs w:val="24"/>
         </w:rPr>
-        <w:t>.append</w:t>
-      </w:r>
-      <w:proofErr w:type="spellEnd"/>
-      <w:proofErr w:type="gramEnd"/>
-      <w:r>
-        <w:rPr>
-          <w:rFonts w:ascii="Consolas" w:hAnsi="Consolas" w:cs="Consolas"/>
-          <w:color w:val="000000"/>
-          <w:sz w:val="24"/>
-          <w:szCs w:val="24"/>
-        </w:rPr>
-        <w:t>(</w:t>
-      </w:r>
-      <w:proofErr w:type="spellStart"/>
-      <w:r>
-        <w:rPr>
-          <w:rFonts w:ascii="Consolas" w:hAnsi="Consolas" w:cs="Consolas"/>
-          <w:color w:val="000000"/>
-          <w:sz w:val="24"/>
-          <w:szCs w:val="24"/>
-        </w:rPr>
-        <w:t>String.</w:t>
+        <w:t>.append(String.</w:t>
       </w:r>
       <w:r>
         <w:rPr>
@@ -5115,7 +4444,6 @@
         </w:rPr>
         <w:t>format</w:t>
       </w:r>
-      <w:proofErr w:type="spellEnd"/>
       <w:r>
         <w:rPr>
           <w:rFonts w:ascii="Consolas" w:hAnsi="Consolas" w:cs="Consolas"/>
@@ -5206,7 +4534,6 @@
         </w:rPr>
         <w:tab/>
       </w:r>
-      <w:proofErr w:type="spellStart"/>
       <w:r>
         <w:rPr>
           <w:rFonts w:ascii="Consolas" w:hAnsi="Consolas" w:cs="Consolas"/>
@@ -5252,7 +4579,6 @@
         </w:rPr>
         <w:t>county</w:t>
       </w:r>
-      <w:proofErr w:type="spellEnd"/>
       <w:r>
         <w:rPr>
           <w:rFonts w:ascii="Consolas" w:hAnsi="Consolas" w:cs="Consolas"/>
@@ -5312,8 +4638,6 @@
         </w:rPr>
         <w:t xml:space="preserve">      </w:t>
       </w:r>
-      <w:proofErr w:type="spellStart"/>
-      <w:proofErr w:type="gramStart"/>
       <w:r>
         <w:rPr>
           <w:rFonts w:ascii="Consolas" w:hAnsi="Consolas" w:cs="Consolas"/>
@@ -5332,19 +4656,7 @@
           <w:szCs w:val="20"/>
           <w:shd w:val="clear" w:color="auto" w:fill="E8F2FE"/>
         </w:rPr>
-        <w:t>.close</w:t>
-      </w:r>
-      <w:proofErr w:type="spellEnd"/>
-      <w:proofErr w:type="gramEnd"/>
-      <w:r>
-        <w:rPr>
-          <w:rFonts w:ascii="Consolas" w:hAnsi="Consolas" w:cs="Consolas"/>
-          <w:color w:val="000000"/>
-          <w:sz w:val="24"/>
-          <w:szCs w:val="20"/>
-          <w:shd w:val="clear" w:color="auto" w:fill="E8F2FE"/>
-        </w:rPr>
-        <w:t>();</w:t>
+        <w:t>.close();</w:t>
       </w:r>
     </w:p>
     <w:p>
@@ -5370,7 +4682,6 @@
         </w:rPr>
         <w:t xml:space="preserve">      </w:t>
       </w:r>
-      <w:proofErr w:type="spellStart"/>
       <w:r>
         <w:rPr>
           <w:rFonts w:ascii="Consolas" w:hAnsi="Consolas" w:cs="Consolas"/>
@@ -5410,20 +4721,8 @@
           <w:sz w:val="24"/>
           <w:szCs w:val="24"/>
         </w:rPr>
-        <w:t>.println</w:t>
-      </w:r>
-      <w:proofErr w:type="spellEnd"/>
-      <w:r>
-        <w:rPr>
-          <w:rFonts w:ascii="Consolas" w:hAnsi="Consolas" w:cs="Consolas"/>
-          <w:color w:val="000000"/>
-          <w:sz w:val="24"/>
-          <w:szCs w:val="24"/>
-        </w:rPr>
-        <w:t>(</w:t>
-      </w:r>
-      <w:proofErr w:type="spellStart"/>
-      <w:proofErr w:type="gramStart"/>
+        <w:t>.println(</w:t>
+      </w:r>
       <w:r>
         <w:rPr>
           <w:rFonts w:ascii="Consolas" w:hAnsi="Consolas" w:cs="Consolas"/>
@@ -5440,18 +4739,7 @@
           <w:sz w:val="24"/>
           <w:szCs w:val="24"/>
         </w:rPr>
-        <w:t>.toString</w:t>
-      </w:r>
-      <w:proofErr w:type="spellEnd"/>
-      <w:proofErr w:type="gramEnd"/>
-      <w:r>
-        <w:rPr>
-          <w:rFonts w:ascii="Consolas" w:hAnsi="Consolas" w:cs="Consolas"/>
-          <w:color w:val="000000"/>
-          <w:sz w:val="24"/>
-          <w:szCs w:val="24"/>
-        </w:rPr>
-        <w:t>());</w:t>
+        <w:t>.toString());</w:t>
       </w:r>
     </w:p>
     <w:p>
@@ -5628,7 +4916,6 @@
         </w:rPr>
         <w:t xml:space="preserve">String </w:t>
       </w:r>
-      <w:proofErr w:type="spellStart"/>
       <w:r>
         <w:rPr>
           <w:rFonts w:ascii="Consolas" w:hAnsi="Consolas" w:cs="Consolas"/>
@@ -5638,7 +4925,6 @@
         </w:rPr>
         <w:t>sql</w:t>
       </w:r>
-      <w:proofErr w:type="spellEnd"/>
       <w:r>
         <w:rPr>
           <w:rFonts w:ascii="Consolas" w:hAnsi="Consolas" w:cs="Consolas"/>
@@ -5657,59 +4943,13 @@
         </w:rPr>
         <w:t xml:space="preserve">"select </w:t>
       </w:r>
-      <w:proofErr w:type="spellStart"/>
-      <w:r>
-        <w:rPr>
-          <w:rFonts w:ascii="Consolas" w:hAnsi="Consolas" w:cs="Consolas"/>
-          <w:color w:val="000000"/>
-          <w:szCs w:val="24"/>
-        </w:rPr>
-        <w:t>company_no</w:t>
-      </w:r>
-      <w:proofErr w:type="spellEnd"/>
-      <w:r>
-        <w:rPr>
-          <w:rFonts w:ascii="Consolas" w:hAnsi="Consolas" w:cs="Consolas"/>
-          <w:color w:val="000000"/>
-          <w:szCs w:val="24"/>
-        </w:rPr>
-        <w:t xml:space="preserve">, </w:t>
-      </w:r>
-      <w:proofErr w:type="spellStart"/>
-      <w:r>
-        <w:rPr>
-          <w:rFonts w:ascii="Consolas" w:hAnsi="Consolas" w:cs="Consolas"/>
-          <w:color w:val="000000"/>
-          <w:szCs w:val="24"/>
-        </w:rPr>
-        <w:t>company_name</w:t>
-      </w:r>
-      <w:proofErr w:type="spellEnd"/>
-      <w:r>
-        <w:rPr>
-          <w:rFonts w:ascii="Consolas" w:hAnsi="Consolas" w:cs="Consolas"/>
-          <w:color w:val="000000"/>
-          <w:szCs w:val="24"/>
-        </w:rPr>
-        <w:t xml:space="preserve">, </w:t>
-      </w:r>
-      <w:proofErr w:type="spellStart"/>
-      <w:r>
-        <w:rPr>
-          <w:rFonts w:ascii="Consolas" w:hAnsi="Consolas" w:cs="Consolas"/>
-          <w:color w:val="000000"/>
-          <w:szCs w:val="24"/>
-        </w:rPr>
-        <w:t>post_code</w:t>
-      </w:r>
-      <w:proofErr w:type="spellEnd"/>
-      <w:r>
-        <w:rPr>
-          <w:rFonts w:ascii="Consolas" w:hAnsi="Consolas" w:cs="Consolas"/>
-          <w:color w:val="000000"/>
-          <w:szCs w:val="24"/>
-        </w:rPr>
-        <w:t>, county</w:t>
+      <w:r>
+        <w:rPr>
+          <w:rFonts w:ascii="Consolas" w:hAnsi="Consolas" w:cs="Consolas"/>
+          <w:color w:val="000000"/>
+          <w:szCs w:val="24"/>
+        </w:rPr>
+        <w:t>company_no, company_name, post_code, county</w:t>
       </w:r>
       <w:r>
         <w:rPr>
@@ -5801,7 +5041,6 @@
         </w:rPr>
         <w:t xml:space="preserve">=? AND </w:t>
       </w:r>
-      <w:proofErr w:type="spellStart"/>
       <w:r>
         <w:rPr>
           <w:rFonts w:ascii="Consolas" w:hAnsi="Consolas" w:cs="Consolas"/>
@@ -5811,7 +5050,6 @@
         </w:rPr>
         <w:t>post_code</w:t>
       </w:r>
-      <w:proofErr w:type="spellEnd"/>
       <w:r>
         <w:rPr>
           <w:rFonts w:ascii="Consolas" w:hAnsi="Consolas" w:cs="Consolas"/>
@@ -5819,27 +5057,7 @@
           <w:sz w:val="24"/>
           <w:szCs w:val="24"/>
         </w:rPr>
-        <w:t xml:space="preserve"> </w:t>
-      </w:r>
-      <w:proofErr w:type="gramStart"/>
-      <w:r>
-        <w:rPr>
-          <w:rFonts w:ascii="Consolas" w:hAnsi="Consolas" w:cs="Consolas"/>
-          <w:color w:val="2A00FF"/>
-          <w:sz w:val="24"/>
-          <w:szCs w:val="24"/>
-        </w:rPr>
-        <w:t>like ?</w:t>
-      </w:r>
-      <w:proofErr w:type="gramEnd"/>
-      <w:r>
-        <w:rPr>
-          <w:rFonts w:ascii="Consolas" w:hAnsi="Consolas" w:cs="Consolas"/>
-          <w:color w:val="2A00FF"/>
-          <w:sz w:val="24"/>
-          <w:szCs w:val="24"/>
-        </w:rPr>
-        <w:t>"</w:t>
+        <w:t xml:space="preserve"> like ?"</w:t>
       </w:r>
       <w:r>
         <w:rPr>
@@ -5887,8 +5105,6 @@
         </w:rPr>
         <w:t xml:space="preserve"> = </w:t>
       </w:r>
-      <w:proofErr w:type="spellStart"/>
-      <w:proofErr w:type="gramStart"/>
       <w:r>
         <w:rPr>
           <w:rFonts w:ascii="Consolas" w:hAnsi="Consolas" w:cs="Consolas"/>
@@ -5903,19 +5119,8 @@
           <w:color w:val="000000"/>
           <w:szCs w:val="24"/>
         </w:rPr>
-        <w:t>.prepareStatement</w:t>
-      </w:r>
-      <w:proofErr w:type="spellEnd"/>
-      <w:proofErr w:type="gramEnd"/>
-      <w:r>
-        <w:rPr>
-          <w:rFonts w:ascii="Consolas" w:hAnsi="Consolas" w:cs="Consolas"/>
-          <w:color w:val="000000"/>
-          <w:szCs w:val="24"/>
-        </w:rPr>
-        <w:t>(</w:t>
-      </w:r>
-      <w:proofErr w:type="spellStart"/>
+        <w:t>.prepareStatement(</w:t>
+      </w:r>
       <w:r>
         <w:rPr>
           <w:rFonts w:ascii="Consolas" w:hAnsi="Consolas" w:cs="Consolas"/>
@@ -5924,7 +5129,6 @@
         </w:rPr>
         <w:t>sql</w:t>
       </w:r>
-      <w:proofErr w:type="spellEnd"/>
       <w:r>
         <w:rPr>
           <w:rFonts w:ascii="Consolas" w:hAnsi="Consolas" w:cs="Consolas"/>
@@ -6044,8 +5248,6 @@
         </w:rPr>
         <w:tab/>
       </w:r>
-      <w:proofErr w:type="spellStart"/>
-      <w:proofErr w:type="gramStart"/>
       <w:r>
         <w:rPr>
           <w:rFonts w:ascii="Consolas" w:hAnsi="Consolas" w:cs="Consolas"/>
@@ -6060,17 +5262,7 @@
           <w:color w:val="000000"/>
           <w:szCs w:val="24"/>
         </w:rPr>
-        <w:t>.setString</w:t>
-      </w:r>
-      <w:proofErr w:type="spellEnd"/>
-      <w:proofErr w:type="gramEnd"/>
-      <w:r>
-        <w:rPr>
-          <w:rFonts w:ascii="Consolas" w:hAnsi="Consolas" w:cs="Consolas"/>
-          <w:color w:val="000000"/>
-          <w:szCs w:val="24"/>
-        </w:rPr>
-        <w:t>(1,</w:t>
+        <w:t>.setString(1,</w:t>
       </w:r>
       <w:r>
         <w:rPr>
@@ -6157,8 +5349,6 @@
         <w:lastRenderedPageBreak/>
         <w:tab/>
       </w:r>
-      <w:proofErr w:type="spellStart"/>
-      <w:proofErr w:type="gramStart"/>
       <w:r>
         <w:rPr>
           <w:rFonts w:ascii="Consolas" w:hAnsi="Consolas" w:cs="Consolas"/>
@@ -6173,17 +5363,7 @@
           <w:color w:val="000000"/>
           <w:szCs w:val="24"/>
         </w:rPr>
-        <w:t>.setString</w:t>
-      </w:r>
-      <w:proofErr w:type="spellEnd"/>
-      <w:proofErr w:type="gramEnd"/>
-      <w:r>
-        <w:rPr>
-          <w:rFonts w:ascii="Consolas" w:hAnsi="Consolas" w:cs="Consolas"/>
-          <w:color w:val="000000"/>
-          <w:szCs w:val="24"/>
-        </w:rPr>
-        <w:t>(2</w:t>
+        <w:t>.setString(2</w:t>
       </w:r>
       <w:r>
         <w:rPr>
@@ -6264,25 +5444,7 @@
           <w:szCs w:val="24"/>
         </w:rPr>
         <w:tab/>
-        <w:t xml:space="preserve"> (</w:t>
-      </w:r>
-      <w:proofErr w:type="spellStart"/>
-      <w:r>
-        <w:rPr>
-          <w:rFonts w:ascii="Consolas" w:hAnsi="Consolas" w:cs="Consolas"/>
-          <w:color w:val="3F7F5F"/>
-          <w:szCs w:val="24"/>
-        </w:rPr>
-        <w:t>contactName</w:t>
-      </w:r>
-      <w:proofErr w:type="spellEnd"/>
-      <w:r>
-        <w:rPr>
-          <w:rFonts w:ascii="Consolas" w:hAnsi="Consolas" w:cs="Consolas"/>
-          <w:color w:val="3F7F5F"/>
-          <w:szCs w:val="24"/>
-        </w:rPr>
-        <w:t>)</w:t>
+        <w:t xml:space="preserve"> (contactName)</w:t>
       </w:r>
     </w:p>
     <w:p>
@@ -6331,26 +5493,8 @@
           <w:szCs w:val="24"/>
         </w:rPr>
         <w:tab/>
-      </w:r>
-      <w:proofErr w:type="spellStart"/>
-      <w:r>
-        <w:rPr>
-          <w:rFonts w:ascii="Consolas" w:hAnsi="Consolas" w:cs="Consolas"/>
-          <w:color w:val="000000"/>
-          <w:szCs w:val="24"/>
-        </w:rPr>
-        <w:t>ResultSet</w:t>
-      </w:r>
-      <w:proofErr w:type="spellEnd"/>
-      <w:r>
-        <w:rPr>
-          <w:rFonts w:ascii="Consolas" w:hAnsi="Consolas" w:cs="Consolas"/>
-          <w:color w:val="000000"/>
-          <w:szCs w:val="24"/>
-        </w:rPr>
-        <w:t xml:space="preserve"> </w:t>
-      </w:r>
-      <w:proofErr w:type="spellStart"/>
+        <w:t xml:space="preserve">ResultSet </w:t>
+      </w:r>
       <w:r>
         <w:rPr>
           <w:rFonts w:ascii="Consolas" w:hAnsi="Consolas" w:cs="Consolas"/>
@@ -6359,7 +5503,6 @@
         </w:rPr>
         <w:t>resultSet</w:t>
       </w:r>
-      <w:proofErr w:type="spellEnd"/>
       <w:r>
         <w:rPr>
           <w:rFonts w:ascii="Consolas" w:hAnsi="Consolas" w:cs="Consolas"/>
@@ -6368,8 +5511,6 @@
         </w:rPr>
         <w:t xml:space="preserve"> = </w:t>
       </w:r>
-      <w:proofErr w:type="spellStart"/>
-      <w:proofErr w:type="gramStart"/>
       <w:r>
         <w:rPr>
           <w:rFonts w:ascii="Consolas" w:hAnsi="Consolas" w:cs="Consolas"/>
@@ -6384,17 +5525,7 @@
           <w:color w:val="000000"/>
           <w:szCs w:val="24"/>
         </w:rPr>
-        <w:t>.executeQuery</w:t>
-      </w:r>
-      <w:proofErr w:type="spellEnd"/>
-      <w:proofErr w:type="gramEnd"/>
-      <w:r>
-        <w:rPr>
-          <w:rFonts w:ascii="Consolas" w:hAnsi="Consolas" w:cs="Consolas"/>
-          <w:color w:val="000000"/>
-          <w:szCs w:val="24"/>
-        </w:rPr>
-        <w:t>();</w:t>
+        <w:t>.executeQuery();</w:t>
       </w:r>
     </w:p>
     <w:p>
@@ -6438,68 +5569,13 @@
         </w:rPr>
         <w:t xml:space="preserve"> </w:t>
       </w:r>
-      <w:proofErr w:type="spellStart"/>
-      <w:r>
-        <w:rPr>
-          <w:rFonts w:ascii="Consolas" w:hAnsi="Consolas" w:cs="Consolas"/>
-          <w:color w:val="000000"/>
-          <w:szCs w:val="24"/>
-        </w:rPr>
-        <w:t>company_no</w:t>
-      </w:r>
-      <w:proofErr w:type="spellEnd"/>
-      <w:r>
-        <w:rPr>
-          <w:rFonts w:ascii="Consolas" w:hAnsi="Consolas" w:cs="Consolas"/>
-          <w:color w:val="000000"/>
-          <w:szCs w:val="24"/>
-        </w:rPr>
-        <w:t xml:space="preserve">, </w:t>
-      </w:r>
-      <w:proofErr w:type="spellStart"/>
-      <w:r>
-        <w:rPr>
-          <w:rFonts w:ascii="Consolas" w:hAnsi="Consolas" w:cs="Consolas"/>
-          <w:color w:val="000000"/>
-          <w:szCs w:val="24"/>
-        </w:rPr>
-        <w:t>company_name</w:t>
-      </w:r>
-      <w:proofErr w:type="spellEnd"/>
-      <w:r>
-        <w:rPr>
-          <w:rFonts w:ascii="Consolas" w:hAnsi="Consolas" w:cs="Consolas"/>
-          <w:color w:val="000000"/>
-          <w:szCs w:val="24"/>
-        </w:rPr>
-        <w:t xml:space="preserve">, </w:t>
-      </w:r>
-      <w:proofErr w:type="spellStart"/>
-      <w:r>
-        <w:rPr>
-          <w:rFonts w:ascii="Consolas" w:hAnsi="Consolas" w:cs="Consolas"/>
-          <w:color w:val="000000"/>
-          <w:szCs w:val="24"/>
-        </w:rPr>
-        <w:t>post_code</w:t>
-      </w:r>
-      <w:proofErr w:type="spellEnd"/>
-      <w:r>
-        <w:rPr>
-          <w:rFonts w:ascii="Consolas" w:hAnsi="Consolas" w:cs="Consolas"/>
-          <w:color w:val="000000"/>
-          <w:szCs w:val="24"/>
-        </w:rPr>
-        <w:t xml:space="preserve">, </w:t>
-      </w:r>
-      <w:proofErr w:type="gramStart"/>
-      <w:r>
-        <w:rPr>
-          <w:rFonts w:ascii="Consolas" w:hAnsi="Consolas" w:cs="Consolas"/>
-          <w:color w:val="000000"/>
-          <w:szCs w:val="24"/>
-        </w:rPr>
-        <w:t>county</w:t>
+      <w:r>
+        <w:rPr>
+          <w:rFonts w:ascii="Consolas" w:hAnsi="Consolas" w:cs="Consolas"/>
+          <w:color w:val="000000"/>
+          <w:szCs w:val="24"/>
+        </w:rPr>
+        <w:t>company_no, company_name, post_code, county</w:t>
       </w:r>
       <w:r>
         <w:rPr>
@@ -6509,7 +5585,6 @@
         </w:rPr>
         <w:t>;</w:t>
       </w:r>
-      <w:proofErr w:type="gramEnd"/>
     </w:p>
     <w:p>
       <w:pPr>
@@ -6572,25 +5647,7 @@
           <w:color w:val="000000"/>
           <w:szCs w:val="24"/>
         </w:rPr>
-        <w:t xml:space="preserve"> </w:t>
-      </w:r>
-      <w:proofErr w:type="gramStart"/>
-      <w:r>
-        <w:rPr>
-          <w:rFonts w:ascii="Consolas" w:hAnsi="Consolas" w:cs="Consolas"/>
-          <w:color w:val="000000"/>
-          <w:szCs w:val="24"/>
-        </w:rPr>
-        <w:t>StringBuilder(</w:t>
-      </w:r>
-      <w:proofErr w:type="gramEnd"/>
-      <w:r>
-        <w:rPr>
-          <w:rFonts w:ascii="Consolas" w:hAnsi="Consolas" w:cs="Consolas"/>
-          <w:color w:val="000000"/>
-          <w:szCs w:val="24"/>
-        </w:rPr>
-        <w:t>) ;</w:t>
+        <w:t xml:space="preserve"> StringBuilder() ;</w:t>
       </w:r>
     </w:p>
     <w:p>
@@ -6636,18 +5693,8 @@
           <w:color w:val="000000"/>
           <w:szCs w:val="24"/>
         </w:rPr>
-        <w:t xml:space="preserve"> </w:t>
-      </w:r>
-      <w:proofErr w:type="gramStart"/>
-      <w:r>
-        <w:rPr>
-          <w:rFonts w:ascii="Consolas" w:hAnsi="Consolas" w:cs="Consolas"/>
-          <w:color w:val="000000"/>
-          <w:szCs w:val="24"/>
-        </w:rPr>
-        <w:t xml:space="preserve">( </w:t>
-      </w:r>
-      <w:proofErr w:type="spellStart"/>
+        <w:t xml:space="preserve"> ( </w:t>
+      </w:r>
       <w:r>
         <w:rPr>
           <w:rFonts w:ascii="Consolas" w:hAnsi="Consolas" w:cs="Consolas"/>
@@ -6662,17 +5709,7 @@
           <w:color w:val="000000"/>
           <w:szCs w:val="24"/>
         </w:rPr>
-        <w:t>.next</w:t>
-      </w:r>
-      <w:proofErr w:type="spellEnd"/>
-      <w:proofErr w:type="gramEnd"/>
-      <w:r>
-        <w:rPr>
-          <w:rFonts w:ascii="Consolas" w:hAnsi="Consolas" w:cs="Consolas"/>
-          <w:color w:val="000000"/>
-          <w:szCs w:val="24"/>
-        </w:rPr>
-        <w:t>() ){</w:t>
+        <w:t>.next() ){</w:t>
       </w:r>
     </w:p>
     <w:p>
@@ -6702,7 +5739,6 @@
         </w:rPr>
         <w:t xml:space="preserve">  </w:t>
       </w:r>
-      <w:proofErr w:type="spellStart"/>
       <w:r>
         <w:rPr>
           <w:rFonts w:ascii="Consolas" w:hAnsi="Consolas" w:cs="Consolas"/>
@@ -6711,7 +5747,6 @@
         </w:rPr>
         <w:t>company_no</w:t>
       </w:r>
-      <w:proofErr w:type="spellEnd"/>
       <w:r>
         <w:rPr>
           <w:rFonts w:ascii="Consolas" w:hAnsi="Consolas" w:cs="Consolas"/>
@@ -6720,7 +5755,6 @@
         </w:rPr>
         <w:t xml:space="preserve"> = </w:t>
       </w:r>
-      <w:proofErr w:type="spellStart"/>
       <w:r>
         <w:rPr>
           <w:rFonts w:ascii="Consolas" w:hAnsi="Consolas" w:cs="Consolas"/>
@@ -6735,27 +5769,8 @@
           <w:color w:val="000000"/>
           <w:szCs w:val="24"/>
         </w:rPr>
-        <w:t>.getString</w:t>
-      </w:r>
-      <w:proofErr w:type="spellEnd"/>
-      <w:r>
-        <w:rPr>
-          <w:rFonts w:ascii="Consolas" w:hAnsi="Consolas" w:cs="Consolas"/>
-          <w:color w:val="000000"/>
-          <w:szCs w:val="24"/>
-        </w:rPr>
-        <w:t>(1</w:t>
-      </w:r>
-      <w:proofErr w:type="gramStart"/>
-      <w:r>
-        <w:rPr>
-          <w:rFonts w:ascii="Consolas" w:hAnsi="Consolas" w:cs="Consolas"/>
-          <w:color w:val="000000"/>
-          <w:szCs w:val="24"/>
-        </w:rPr>
-        <w:t>);</w:t>
-      </w:r>
-      <w:proofErr w:type="gramEnd"/>
+        <w:t>.getString(1);</w:t>
+      </w:r>
     </w:p>
     <w:p>
       <w:pPr>
@@ -6784,7 +5799,6 @@
         </w:rPr>
         <w:t xml:space="preserve">  </w:t>
       </w:r>
-      <w:proofErr w:type="spellStart"/>
       <w:r>
         <w:rPr>
           <w:rFonts w:ascii="Consolas" w:hAnsi="Consolas" w:cs="Consolas"/>
@@ -6794,7 +5808,6 @@
         </w:rPr>
         <w:t>company_name</w:t>
       </w:r>
-      <w:proofErr w:type="spellEnd"/>
       <w:r>
         <w:rPr>
           <w:rFonts w:ascii="Consolas" w:hAnsi="Consolas" w:cs="Consolas"/>
@@ -6811,7 +5824,6 @@
         </w:rPr>
         <w:t xml:space="preserve">= </w:t>
       </w:r>
-      <w:proofErr w:type="spellStart"/>
       <w:r>
         <w:rPr>
           <w:rFonts w:ascii="Consolas" w:hAnsi="Consolas" w:cs="Consolas"/>
@@ -6826,27 +5838,8 @@
           <w:color w:val="000000"/>
           <w:szCs w:val="24"/>
         </w:rPr>
-        <w:t>.getString</w:t>
-      </w:r>
-      <w:proofErr w:type="spellEnd"/>
-      <w:r>
-        <w:rPr>
-          <w:rFonts w:ascii="Consolas" w:hAnsi="Consolas" w:cs="Consolas"/>
-          <w:color w:val="000000"/>
-          <w:szCs w:val="24"/>
-        </w:rPr>
-        <w:t>(2</w:t>
-      </w:r>
-      <w:proofErr w:type="gramStart"/>
-      <w:r>
-        <w:rPr>
-          <w:rFonts w:ascii="Consolas" w:hAnsi="Consolas" w:cs="Consolas"/>
-          <w:color w:val="000000"/>
-          <w:szCs w:val="24"/>
-        </w:rPr>
-        <w:t>) ;</w:t>
-      </w:r>
-      <w:proofErr w:type="gramEnd"/>
+        <w:t>.getString(2) ;</w:t>
+      </w:r>
     </w:p>
     <w:p>
       <w:pPr>
@@ -6868,7 +5861,6 @@
         <w:tab/>
         <w:t xml:space="preserve">  </w:t>
       </w:r>
-      <w:proofErr w:type="spellStart"/>
       <w:r>
         <w:rPr>
           <w:rFonts w:ascii="Consolas" w:hAnsi="Consolas" w:cs="Consolas"/>
@@ -6878,7 +5870,6 @@
         </w:rPr>
         <w:t>post_code</w:t>
       </w:r>
-      <w:proofErr w:type="spellEnd"/>
       <w:r>
         <w:rPr>
           <w:rFonts w:ascii="Consolas" w:hAnsi="Consolas" w:cs="Consolas"/>
@@ -6887,7 +5878,6 @@
         </w:rPr>
         <w:t xml:space="preserve"> = </w:t>
       </w:r>
-      <w:proofErr w:type="spellStart"/>
       <w:r>
         <w:rPr>
           <w:rFonts w:ascii="Consolas" w:hAnsi="Consolas" w:cs="Consolas"/>
@@ -6902,18 +5892,8 @@
           <w:color w:val="000000"/>
           <w:szCs w:val="24"/>
         </w:rPr>
-        <w:t>.getString</w:t>
-      </w:r>
-      <w:proofErr w:type="spellEnd"/>
-      <w:r>
-        <w:rPr>
-          <w:rFonts w:ascii="Consolas" w:hAnsi="Consolas" w:cs="Consolas"/>
-          <w:color w:val="000000"/>
-          <w:szCs w:val="24"/>
-        </w:rPr>
-        <w:t>(3</w:t>
-      </w:r>
-      <w:proofErr w:type="gramStart"/>
+        <w:t>.getString(3</w:t>
+      </w:r>
       <w:r>
         <w:rPr>
           <w:rFonts w:ascii="Consolas" w:hAnsi="Consolas" w:cs="Consolas"/>
@@ -6922,7 +5902,6 @@
         </w:rPr>
         <w:t>) ;</w:t>
       </w:r>
-      <w:proofErr w:type="gramEnd"/>
     </w:p>
     <w:p>
       <w:pPr>
@@ -6969,7 +5948,6 @@
         </w:rPr>
         <w:t xml:space="preserve"> = </w:t>
       </w:r>
-      <w:proofErr w:type="spellStart"/>
       <w:r>
         <w:rPr>
           <w:rFonts w:ascii="Consolas" w:hAnsi="Consolas" w:cs="Consolas"/>
@@ -6984,16 +5962,7 @@
           <w:color w:val="000000"/>
           <w:szCs w:val="24"/>
         </w:rPr>
-        <w:t>.getString</w:t>
-      </w:r>
-      <w:proofErr w:type="spellEnd"/>
-      <w:r>
-        <w:rPr>
-          <w:rFonts w:ascii="Consolas" w:hAnsi="Consolas" w:cs="Consolas"/>
-          <w:color w:val="000000"/>
-          <w:szCs w:val="24"/>
-        </w:rPr>
-        <w:t>(</w:t>
+        <w:t>.getString(</w:t>
       </w:r>
       <w:r>
         <w:rPr>
@@ -7019,7 +5988,6 @@
         </w:rPr>
         <w:t>"</w:t>
       </w:r>
-      <w:proofErr w:type="gramStart"/>
       <w:r>
         <w:rPr>
           <w:rFonts w:ascii="Consolas" w:hAnsi="Consolas" w:cs="Consolas"/>
@@ -7028,7 +5996,6 @@
         </w:rPr>
         <w:t>) ;</w:t>
       </w:r>
-      <w:proofErr w:type="gramEnd"/>
     </w:p>
     <w:p>
       <w:pPr>
@@ -7069,8 +6036,6 @@
         </w:rPr>
         <w:t xml:space="preserve">  </w:t>
       </w:r>
-      <w:proofErr w:type="spellStart"/>
-      <w:proofErr w:type="gramStart"/>
       <w:r>
         <w:rPr>
           <w:rFonts w:ascii="Consolas" w:hAnsi="Consolas" w:cs="Consolas"/>
@@ -7085,26 +6050,7 @@
           <w:color w:val="000000"/>
           <w:szCs w:val="24"/>
         </w:rPr>
-        <w:t>.append</w:t>
-      </w:r>
-      <w:proofErr w:type="spellEnd"/>
-      <w:proofErr w:type="gramEnd"/>
-      <w:r>
-        <w:rPr>
-          <w:rFonts w:ascii="Consolas" w:hAnsi="Consolas" w:cs="Consolas"/>
-          <w:color w:val="000000"/>
-          <w:szCs w:val="24"/>
-        </w:rPr>
-        <w:t>(</w:t>
-      </w:r>
-      <w:proofErr w:type="spellStart"/>
-      <w:r>
-        <w:rPr>
-          <w:rFonts w:ascii="Consolas" w:hAnsi="Consolas" w:cs="Consolas"/>
-          <w:color w:val="000000"/>
-          <w:szCs w:val="24"/>
-        </w:rPr>
-        <w:t>String.</w:t>
+        <w:t>.append(String.</w:t>
       </w:r>
       <w:r>
         <w:rPr>
@@ -7116,7 +6062,6 @@
         </w:rPr>
         <w:t>format</w:t>
       </w:r>
-      <w:proofErr w:type="spellEnd"/>
       <w:r>
         <w:rPr>
           <w:rFonts w:ascii="Consolas" w:hAnsi="Consolas" w:cs="Consolas"/>
@@ -7171,104 +6116,56 @@
           <w:color w:val="2A00FF"/>
           <w:szCs w:val="24"/>
         </w:rPr>
+        <w:t xml:space="preserve"> Post_Code</w:t>
+      </w:r>
+      <w:r>
+        <w:rPr>
+          <w:rFonts w:ascii="Consolas" w:hAnsi="Consolas" w:cs="Consolas"/>
+          <w:color w:val="2A00FF"/>
+          <w:szCs w:val="24"/>
+        </w:rPr>
+        <w:t xml:space="preserve">:%s </w:t>
+      </w:r>
+      <w:r>
+        <w:rPr>
+          <w:rFonts w:ascii="Consolas" w:hAnsi="Consolas" w:cs="Consolas"/>
+          <w:color w:val="2A00FF"/>
+          <w:szCs w:val="24"/>
+        </w:rPr>
+        <w:t>\n"</w:t>
+      </w:r>
+      <w:r>
+        <w:rPr>
+          <w:rFonts w:ascii="Consolas" w:hAnsi="Consolas" w:cs="Consolas"/>
+          <w:color w:val="000000"/>
+          <w:szCs w:val="24"/>
+        </w:rPr>
+        <w:t>,</w:t>
+      </w:r>
+      <w:r>
+        <w:rPr>
+          <w:rFonts w:ascii="Consolas" w:hAnsi="Consolas" w:cs="Consolas"/>
+          <w:color w:val="000000"/>
+          <w:szCs w:val="24"/>
+        </w:rPr>
         <w:t xml:space="preserve"> </w:t>
       </w:r>
-      <w:proofErr w:type="spellStart"/>
-      <w:r>
-        <w:rPr>
-          <w:rFonts w:ascii="Consolas" w:hAnsi="Consolas" w:cs="Consolas"/>
-          <w:color w:val="2A00FF"/>
-          <w:szCs w:val="24"/>
-        </w:rPr>
-        <w:t>Post_Code</w:t>
-      </w:r>
-      <w:proofErr w:type="spellEnd"/>
-      <w:r>
-        <w:rPr>
-          <w:rFonts w:ascii="Consolas" w:hAnsi="Consolas" w:cs="Consolas"/>
-          <w:color w:val="2A00FF"/>
-          <w:szCs w:val="24"/>
-        </w:rPr>
-        <w:t xml:space="preserve">:%s </w:t>
-      </w:r>
-      <w:r>
-        <w:rPr>
-          <w:rFonts w:ascii="Consolas" w:hAnsi="Consolas" w:cs="Consolas"/>
-          <w:color w:val="2A00FF"/>
-          <w:szCs w:val="24"/>
-        </w:rPr>
-        <w:t>\n"</w:t>
-      </w:r>
-      <w:r>
-        <w:rPr>
-          <w:rFonts w:ascii="Consolas" w:hAnsi="Consolas" w:cs="Consolas"/>
-          <w:color w:val="000000"/>
-          <w:szCs w:val="24"/>
-        </w:rPr>
-        <w:t>,</w:t>
-      </w:r>
-      <w:r>
-        <w:rPr>
-          <w:rFonts w:ascii="Consolas" w:hAnsi="Consolas" w:cs="Consolas"/>
-          <w:color w:val="000000"/>
-          <w:szCs w:val="24"/>
-        </w:rPr>
-        <w:t xml:space="preserve"> </w:t>
-      </w:r>
-      <w:proofErr w:type="spellStart"/>
-      <w:r>
-        <w:rPr>
-          <w:rFonts w:ascii="Consolas" w:hAnsi="Consolas" w:cs="Consolas"/>
-          <w:color w:val="000000"/>
-          <w:szCs w:val="24"/>
-        </w:rPr>
-        <w:t>company_no</w:t>
-      </w:r>
-      <w:proofErr w:type="spellEnd"/>
-      <w:r>
-        <w:rPr>
-          <w:rFonts w:ascii="Consolas" w:hAnsi="Consolas" w:cs="Consolas"/>
-          <w:color w:val="000000"/>
-          <w:szCs w:val="24"/>
-        </w:rPr>
-        <w:t xml:space="preserve">, </w:t>
-      </w:r>
-      <w:proofErr w:type="spellStart"/>
-      <w:r>
-        <w:rPr>
-          <w:rFonts w:ascii="Consolas" w:hAnsi="Consolas" w:cs="Consolas"/>
-          <w:color w:val="000000"/>
-          <w:szCs w:val="24"/>
-        </w:rPr>
-        <w:t>company_name</w:t>
-      </w:r>
-      <w:proofErr w:type="spellEnd"/>
-      <w:r>
-        <w:rPr>
-          <w:rFonts w:ascii="Consolas" w:hAnsi="Consolas" w:cs="Consolas"/>
-          <w:color w:val="000000"/>
-          <w:szCs w:val="24"/>
-        </w:rPr>
-        <w:t>, county</w:t>
-      </w:r>
-      <w:r>
-        <w:rPr>
-          <w:rFonts w:ascii="Consolas" w:hAnsi="Consolas" w:cs="Consolas"/>
-          <w:color w:val="000000"/>
-          <w:szCs w:val="24"/>
-        </w:rPr>
-        <w:t xml:space="preserve">, </w:t>
-      </w:r>
-      <w:proofErr w:type="spellStart"/>
-      <w:r>
-        <w:rPr>
-          <w:rFonts w:ascii="Consolas" w:hAnsi="Consolas" w:cs="Consolas"/>
-          <w:color w:val="000000"/>
-          <w:szCs w:val="24"/>
-        </w:rPr>
-        <w:t>post_code</w:t>
-      </w:r>
-      <w:proofErr w:type="spellEnd"/>
+      <w:r>
+        <w:rPr>
+          <w:rFonts w:ascii="Consolas" w:hAnsi="Consolas" w:cs="Consolas"/>
+          <w:color w:val="000000"/>
+          <w:szCs w:val="24"/>
+        </w:rPr>
+        <w:t>company_no, company_name, county</w:t>
+      </w:r>
+      <w:r>
+        <w:rPr>
+          <w:rFonts w:ascii="Consolas" w:hAnsi="Consolas" w:cs="Consolas"/>
+          <w:color w:val="000000"/>
+          <w:szCs w:val="24"/>
+        </w:rPr>
+        <w:t>, post_code</w:t>
+      </w:r>
       <w:r>
         <w:rPr>
           <w:rFonts w:ascii="Consolas" w:hAnsi="Consolas" w:cs="Consolas"/>
@@ -7325,7 +6222,6 @@
         </w:rPr>
         <w:tab/>
       </w:r>
-      <w:proofErr w:type="spellStart"/>
       <w:r>
         <w:rPr>
           <w:rFonts w:ascii="Consolas" w:hAnsi="Consolas" w:cs="Consolas"/>
@@ -7352,19 +6248,8 @@
           <w:color w:val="000000"/>
           <w:szCs w:val="24"/>
         </w:rPr>
-        <w:t>.println</w:t>
-      </w:r>
-      <w:proofErr w:type="spellEnd"/>
-      <w:r>
-        <w:rPr>
-          <w:rFonts w:ascii="Consolas" w:hAnsi="Consolas" w:cs="Consolas"/>
-          <w:color w:val="000000"/>
-          <w:szCs w:val="24"/>
-        </w:rPr>
-        <w:t>(</w:t>
-      </w:r>
-      <w:proofErr w:type="spellStart"/>
-      <w:proofErr w:type="gramStart"/>
+        <w:t>.println(</w:t>
+      </w:r>
       <w:r>
         <w:rPr>
           <w:rFonts w:ascii="Consolas" w:hAnsi="Consolas" w:cs="Consolas"/>
@@ -7379,17 +6264,7 @@
           <w:color w:val="000000"/>
           <w:szCs w:val="24"/>
         </w:rPr>
-        <w:t>.toString</w:t>
-      </w:r>
-      <w:proofErr w:type="spellEnd"/>
-      <w:proofErr w:type="gramEnd"/>
-      <w:r>
-        <w:rPr>
-          <w:rFonts w:ascii="Consolas" w:hAnsi="Consolas" w:cs="Consolas"/>
-          <w:color w:val="000000"/>
-          <w:szCs w:val="24"/>
-        </w:rPr>
-        <w:t>());</w:t>
+        <w:t>.toString());</w:t>
       </w:r>
     </w:p>
     <w:p>
@@ -7425,7 +6300,6 @@
         </w:rPr>
         <w:t xml:space="preserve">Now try inserting a new row into the </w:t>
       </w:r>
-      <w:proofErr w:type="gramStart"/>
       <w:r>
         <w:rPr>
           <w:rFonts w:ascii="Consolas" w:hAnsi="Consolas" w:cs="Consolas"/>
@@ -7436,7 +6310,6 @@
         </w:rPr>
         <w:t>customers</w:t>
       </w:r>
-      <w:proofErr w:type="gramEnd"/>
       <w:r>
         <w:rPr>
           <w:rFonts w:ascii="Consolas" w:hAnsi="Consolas" w:cs="Consolas"/>
@@ -7471,8 +6344,6 @@
         </w:rPr>
         <w:t xml:space="preserve"> use the statement's </w:t>
       </w:r>
-      <w:proofErr w:type="spellStart"/>
-      <w:proofErr w:type="gramStart"/>
       <w:r>
         <w:rPr>
           <w:rFonts w:ascii="Consolas" w:hAnsi="Consolas" w:cs="Consolas"/>
@@ -7483,7 +6354,6 @@
         </w:rPr>
         <w:t>executeUpdate</w:t>
       </w:r>
-      <w:proofErr w:type="spellEnd"/>
       <w:r>
         <w:rPr>
           <w:rFonts w:ascii="Consolas" w:hAnsi="Consolas" w:cs="Consolas"/>
@@ -7492,18 +6362,7 @@
           <w:color w:val="000000"/>
           <w:szCs w:val="24"/>
         </w:rPr>
-        <w:t>(</w:t>
-      </w:r>
-      <w:proofErr w:type="gramEnd"/>
-      <w:r>
-        <w:rPr>
-          <w:rFonts w:ascii="Consolas" w:hAnsi="Consolas" w:cs="Consolas"/>
-          <w:b/>
-          <w:bCs/>
-          <w:color w:val="000000"/>
-          <w:szCs w:val="24"/>
-        </w:rPr>
-        <w:t xml:space="preserve">) </w:t>
+        <w:t xml:space="preserve">() </w:t>
       </w:r>
       <w:r>
         <w:rPr>
@@ -7613,7 +6472,7 @@
 </file>
 
 <file path=word/numbering.xml><?xml version="1.0" encoding="utf-8"?>
-<w:numbering xmlns:wpc="http://schemas.microsoft.com/office/word/2010/wordprocessingCanvas" xmlns:cx="http://schemas.microsoft.com/office/drawing/2014/chartex" xmlns:cx1="http://schemas.microsoft.com/office/drawing/2015/9/8/chartex" xmlns:cx2="http://schemas.microsoft.com/office/drawing/2015/10/21/chartex" xmlns:cx3="http://schemas.microsoft.com/office/drawing/2016/5/9/chartex" xmlns:cx4="http://schemas.microsoft.com/office/drawing/2016/5/10/chartex" xmlns:cx5="http://schemas.microsoft.com/office/drawing/2016/5/11/chartex" xmlns:cx6="http://schemas.microsoft.com/office/drawing/2016/5/12/chartex" xmlns:cx7="http://schemas.microsoft.com/office/drawing/2016/5/13/chartex" xmlns:cx8="http://schemas.microsoft.com/office/drawing/2016/5/14/chartex" xmlns:mc="http://schemas.openxmlformats.org/markup-compatibility/2006" xmlns:aink="http://schemas.microsoft.com/office/drawing/2016/ink" xmlns:am3d="http://schemas.microsoft.com/office/drawing/2017/model3d" xmlns:o="urn:schemas-microsoft-com:office:office" xmlns:oel="http://schemas.microsoft.com/office/2019/extlst" xmlns:r="http://schemas.openxmlformats.org/officeDocument/2006/relationships" xmlns:m="http://schemas.openxmlformats.org/officeDocument/2006/math" xmlns:v="urn:schemas-microsoft-com:vml" xmlns:wp14="http://schemas.microsoft.com/office/word/2010/wordprocessingDrawing" xmlns:wp="http://schemas.openxmlformats.org/drawingml/2006/wordprocessingDrawing" xmlns:w10="urn:schemas-microsoft-com:office:word" xmlns:w="http://schemas.openxmlformats.org/wordprocessingml/2006/main" xmlns:w14="http://schemas.microsoft.com/office/word/2010/wordml" xmlns:w15="http://schemas.microsoft.com/office/word/2012/wordml" xmlns:w16cex="http://schemas.microsoft.com/office/word/2018/wordml/cex" xmlns:w16cid="http://schemas.microsoft.com/office/word/2016/wordml/cid" xmlns:w16="http://schemas.microsoft.com/office/word/2018/wordml" xmlns:w16sdtdh="http://schemas.microsoft.com/office/word/2020/wordml/sdtdatahash" xmlns:w16se="http://schemas.microsoft.com/office/word/2015/wordml/symex" xmlns:wpg="http://schemas.microsoft.com/office/word/2010/wordprocessingGroup" xmlns:wpi="http://schemas.microsoft.com/office/word/2010/wordprocessingInk" xmlns:wne="http://schemas.microsoft.com/office/word/2006/wordml" xmlns:wps="http://schemas.microsoft.com/office/word/2010/wordprocessingShape" mc:Ignorable="w14 w15 w16se w16cid w16 w16cex w16sdtdh wp14">
+<w:numbering xmlns:wpc="http://schemas.microsoft.com/office/word/2010/wordprocessingCanvas" xmlns:cx="http://schemas.microsoft.com/office/drawing/2014/chartex" xmlns:cx1="http://schemas.microsoft.com/office/drawing/2015/9/8/chartex" xmlns:cx2="http://schemas.microsoft.com/office/drawing/2015/10/21/chartex" xmlns:cx3="http://schemas.microsoft.com/office/drawing/2016/5/9/chartex" xmlns:cx4="http://schemas.microsoft.com/office/drawing/2016/5/10/chartex" xmlns:cx5="http://schemas.microsoft.com/office/drawing/2016/5/11/chartex" xmlns:cx6="http://schemas.microsoft.com/office/drawing/2016/5/12/chartex" xmlns:cx7="http://schemas.microsoft.com/office/drawing/2016/5/13/chartex" xmlns:cx8="http://schemas.microsoft.com/office/drawing/2016/5/14/chartex" xmlns:mc="http://schemas.openxmlformats.org/markup-compatibility/2006" xmlns:aink="http://schemas.microsoft.com/office/drawing/2016/ink" xmlns:am3d="http://schemas.microsoft.com/office/drawing/2017/model3d" xmlns:o="urn:schemas-microsoft-com:office:office" xmlns:oel="http://schemas.microsoft.com/office/2019/extlst" xmlns:r="http://schemas.openxmlformats.org/officeDocument/2006/relationships" xmlns:m="http://schemas.openxmlformats.org/officeDocument/2006/math" xmlns:v="urn:schemas-microsoft-com:vml" xmlns:wp14="http://schemas.microsoft.com/office/word/2010/wordprocessingDrawing" xmlns:wp="http://schemas.openxmlformats.org/drawingml/2006/wordprocessingDrawing" xmlns:w10="urn:schemas-microsoft-com:office:word" xmlns:w="http://schemas.openxmlformats.org/wordprocessingml/2006/main" xmlns:w14="http://schemas.microsoft.com/office/word/2010/wordml" xmlns:w15="http://schemas.microsoft.com/office/word/2012/wordml" xmlns:w16cex="http://schemas.microsoft.com/office/word/2018/wordml/cex" xmlns:w16cid="http://schemas.microsoft.com/office/word/2016/wordml/cid" xmlns:w16="http://schemas.microsoft.com/office/word/2018/wordml" xmlns:w16du="http://schemas.microsoft.com/office/word/2023/wordml/word16du" xmlns:w16sdtdh="http://schemas.microsoft.com/office/word/2020/wordml/sdtdatahash" xmlns:w16sdtfl="http://schemas.microsoft.com/office/word/2024/wordml/sdtformatlock" xmlns:w16se="http://schemas.microsoft.com/office/word/2015/wordml/symex" xmlns:wpg="http://schemas.microsoft.com/office/word/2010/wordprocessingGroup" xmlns:wpi="http://schemas.microsoft.com/office/word/2010/wordprocessingInk" xmlns:wne="http://schemas.microsoft.com/office/word/2006/wordml" xmlns:wps="http://schemas.microsoft.com/office/word/2010/wordprocessingShape" mc:Ignorable="w14 w15 w16se w16cid w16 w16cex w16sdtdh w16sdtfl w16du wp14">
   <w:abstractNum w:abstractNumId="0" w15:restartNumberingAfterBreak="0">
     <w:nsid w:val="15D06FB7"/>
     <w:multiLevelType w:val="hybridMultilevel"/>
@@ -8706,7 +7565,7 @@
 </file>
 
 <file path=word/styles.xml><?xml version="1.0" encoding="utf-8"?>
-<w:styles xmlns:mc="http://schemas.openxmlformats.org/markup-compatibility/2006" xmlns:r="http://schemas.openxmlformats.org/officeDocument/2006/relationships" xmlns:w="http://schemas.openxmlformats.org/wordprocessingml/2006/main" xmlns:w14="http://schemas.microsoft.com/office/word/2010/wordml" xmlns:w15="http://schemas.microsoft.com/office/word/2012/wordml" xmlns:w16cex="http://schemas.microsoft.com/office/word/2018/wordml/cex" xmlns:w16cid="http://schemas.microsoft.com/office/word/2016/wordml/cid" xmlns:w16="http://schemas.microsoft.com/office/word/2018/wordml" xmlns:w16sdtdh="http://schemas.microsoft.com/office/word/2020/wordml/sdtdatahash" xmlns:w16se="http://schemas.microsoft.com/office/word/2015/wordml/symex" mc:Ignorable="w14 w15 w16se w16cid w16 w16cex w16sdtdh">
+<w:styles xmlns:mc="http://schemas.openxmlformats.org/markup-compatibility/2006" xmlns:r="http://schemas.openxmlformats.org/officeDocument/2006/relationships" xmlns:w="http://schemas.openxmlformats.org/wordprocessingml/2006/main" xmlns:w14="http://schemas.microsoft.com/office/word/2010/wordml" xmlns:w15="http://schemas.microsoft.com/office/word/2012/wordml" xmlns:w16cex="http://schemas.microsoft.com/office/word/2018/wordml/cex" xmlns:w16cid="http://schemas.microsoft.com/office/word/2016/wordml/cid" xmlns:w16="http://schemas.microsoft.com/office/word/2018/wordml" xmlns:w16du="http://schemas.microsoft.com/office/word/2023/wordml/word16du" xmlns:w16sdtdh="http://schemas.microsoft.com/office/word/2020/wordml/sdtdatahash" xmlns:w16sdtfl="http://schemas.microsoft.com/office/word/2024/wordml/sdtformatlock" xmlns:w16se="http://schemas.microsoft.com/office/word/2015/wordml/symex" mc:Ignorable="w14 w15 w16se w16cid w16 w16cex w16sdtdh w16sdtfl w16du">
   <w:docDefaults>
     <w:rPrDefault>
       <w:rPr>

</xml_diff>